<commit_message>
update paper with new results
</commit_message>
<xml_diff>
--- a/0621_Final_Draft_for_Submission.docx
+++ b/0621_Final_Draft_for_Submission.docx
@@ -2,7 +2,7 @@
 <file path=word/document.xml><?xml version="1.0" encoding="utf-8"?>
 <w:document xmlns:w="http://schemas.openxmlformats.org/wordprocessingml/2006/main" xmlns:m="http://schemas.openxmlformats.org/officeDocument/2006/math" xmlns:r="http://schemas.openxmlformats.org/officeDocument/2006/relationships" xmlns:o="urn:schemas-microsoft-com:office:office" xmlns:v="urn:schemas-microsoft-com:vml" xmlns:w10="urn:schemas-microsoft-com:office:word" xmlns:a="http://schemas.openxmlformats.org/drawingml/2006/main" xmlns:pic="http://schemas.openxmlformats.org/drawingml/2006/picture" xmlns:wp="http://schemas.openxmlformats.org/drawingml/2006/wordprocessingDrawing">
   <w:body>
-    <w:bookmarkStart w:id="57" w:name="Xbd7829e55a55d532380878ab97c04e746e1ea0c"/>
+    <w:bookmarkStart w:id="58" w:name="Xbd7829e55a55d532380878ab97c04e746e1ea0c"/>
     <w:p>
       <w:pPr>
         <w:pStyle w:val="Heading1"/>
@@ -107,10 +107,7 @@
         <w:t xml:space="preserve"> </w:t>
       </w:r>
       <w:r>
-        <w:t xml:space="preserve">= 0.68), consistent with a nonlinear rather than proportional mechanism. A threshold specification at</w:t>
-      </w:r>
-      <w:r>
-        <w:t xml:space="preserve"> </w:t>
+        <w:t xml:space="preserve">= 0.68), consistent with a nonlinear rather than proportional mechanism. Separating supply inflows from outflows, we find that supply contractions in low-buffer states (</w:t>
       </w:r>
       <w:r>
         <w:rPr>
@@ -123,10 +120,7 @@
         <w:t xml:space="preserve"> </w:t>
       </w:r>
       <w:r>
-        <w:t xml:space="preserve">&lt; 4% using first-differenced spreads finds a significant interaction (β₃ = −4.39,</w:t>
-      </w:r>
-      <w:r>
-        <w:t xml:space="preserve"> </w:t>
+        <w:t xml:space="preserve">&lt; 12%) are associated with OIS–Treasury spread increases: the Low × Outflow coefficient β₅ = +7.55 (</w:t>
       </w:r>
       <w:r>
         <w:rPr>
@@ -139,7 +133,7 @@
         <w:t xml:space="preserve"> </w:t>
       </w:r>
       <w:r>
-        <w:t xml:space="preserve">= 0.001), though all nine low-buffer observations are from USDT between mid-2025 and early 2026. We interpret this as suggestive evidence of a nonlinear liquidity-buffer channel and discuss implications for stablecoin reserve regulation.</w:t>
+        <w:t xml:space="preserve">= 0.065), identified by six low-buffer outflow observations spanning both issuers. The inflow coefficient is uniformly insignificant, consistent with the asymmetric theoretical prediction that only forced T-bill sales — triggered by outflows when buffers are depleted — generate spread pressure. We interpret this as suggestive evidence of a forced-sale channel and discuss implications for stablecoin reserve regulation.</w:t>
       </w:r>
     </w:p>
     <w:p>
@@ -1108,13 +1102,13 @@
           <w:b/>
           <w:bCs/>
         </w:rPr>
-        <w:t xml:space="preserve">Threshold Specification.</w:t>
-      </w:r>
-      <w:r>
-        <w:t xml:space="preserve"> </w:t>
-      </w:r>
-      <w:r>
-        <w:t xml:space="preserve">To address non-stationarity, we use ΔSpread*_t* = Spread*_t* − Spread*_{t−1}* as the primary dependent variable in our threshold spec, which is stationary by construction. The estimating equation is:</w:t>
+        <w:t xml:space="preserve">Asymmetric Threshold Specification.</w:t>
+      </w:r>
+      <w:r>
+        <w:t xml:space="preserve"> </w:t>
+      </w:r>
+      <w:r>
+        <w:t xml:space="preserve">To address non-stationarity and align with the theoretical mechanism, we use ΔSpread*_t* = Spread*_t* − Spread*_{t−1}* as the primary dependent variable, and decompose monthly supply growth into inflows and outflows:</w:t>
       </w:r>
     </w:p>
     <w:p>
@@ -1122,7 +1116,33 @@
         <w:pStyle w:val="BodyText"/>
       </w:pPr>
       <w:r>
-        <w:t xml:space="preserve">ΔSpread*_t* = α + β₁·ΔlnS*_it* + β₂·</w:t>
+        <w:t xml:space="preserve">Inflow*_it* = max(ΔlnS*_it</w:t>
+      </w:r>
+      <w:r>
+        <w:rPr>
+          <w:i/>
+          <w:iCs/>
+        </w:rPr>
+        <w:t xml:space="preserve">, 0);   Outflow</w:t>
+      </w:r>
+      <w:r>
+        <w:t xml:space="preserve">_it* = max(−ΔlnS*_it*, 0)</w:t>
+      </w:r>
+    </w:p>
+    <w:p>
+      <w:pPr>
+        <w:pStyle w:val="BodyText"/>
+      </w:pPr>
+      <w:r>
+        <w:t xml:space="preserve">The theory predicts that only outflows in low-buffer states trigger forced T-bill sales; inflows (new T-bill purchases) are orderly by construction. We therefore estimate:</w:t>
+      </w:r>
+    </w:p>
+    <w:p>
+      <w:pPr>
+        <w:pStyle w:val="BodyText"/>
+      </w:pPr>
+      <w:r>
+        <w:t xml:space="preserve">ΔSpread*_t* = α + β₁·Inflow*_it* + β₂·Outflow*_it* + β₃·</w:t>
       </w:r>
       <w:r>
         <w:rPr>
@@ -1158,7 +1178,7 @@
         <w:t xml:space="preserve">c</w:t>
       </w:r>
       <w:r>
-        <w:t xml:space="preserve">] + β₃·</w:t>
+        <w:t xml:space="preserve">] + β₄·</w:t>
       </w:r>
       <w:r>
         <w:rPr>
@@ -1194,7 +1214,43 @@
         <w:t xml:space="preserve">c</w:t>
       </w:r>
       <w:r>
-        <w:t xml:space="preserve">]·ΔlnS*_it* + γ·controls + δ·USDT*_i* + ε*_it*</w:t>
+        <w:t xml:space="preserve">]·Inflow*_it* + β₅·</w:t>
+      </w:r>
+      <w:r>
+        <w:rPr>
+          <w:b/>
+          <w:bCs/>
+        </w:rPr>
+        <w:t xml:space="preserve">1</w:t>
+      </w:r>
+      <w:r>
+        <w:t xml:space="preserve">[</w:t>
+      </w:r>
+      <w:r>
+        <w:rPr>
+          <w:i/>
+          <w:iCs/>
+        </w:rPr>
+        <w:t xml:space="preserve">L_it</w:t>
+      </w:r>
+      <w:r>
+        <w:t xml:space="preserve"> </w:t>
+      </w:r>
+      <w:r>
+        <w:t xml:space="preserve">&lt;</w:t>
+      </w:r>
+      <w:r>
+        <w:t xml:space="preserve"> </w:t>
+      </w:r>
+      <w:r>
+        <w:rPr>
+          <w:i/>
+          <w:iCs/>
+        </w:rPr>
+        <w:t xml:space="preserve">c</w:t>
+      </w:r>
+      <w:r>
+        <w:t xml:space="preserve">]·Outflow*_it* + γ·controls + δ·USDT*_i* + ε*_it*</w:t>
       </w:r>
     </w:p>
     <w:p>
@@ -1202,20 +1258,20 @@
         <w:pStyle w:val="BodyText"/>
       </w:pPr>
       <w:r>
-        <w:t xml:space="preserve">where</w:t>
+        <w:t xml:space="preserve">The key coefficient is β₅ (Low × Outflow): a positive and significant β₅ indicates that supply contractions in low-buffer states are associated with spread</w:t>
       </w:r>
       <w:r>
         <w:t xml:space="preserve"> </w:t>
       </w:r>
       <w:r>
         <w:rPr>
-          <w:b/>
-          <w:bCs/>
+          <w:i/>
+          <w:iCs/>
         </w:rPr>
-        <w:t xml:space="preserve">1</w:t>
-      </w:r>
-      <w:r>
-        <w:t xml:space="preserve">[·] is an indicator for the low-buffer regime and</w:t>
+        <w:t xml:space="preserve">increases</w:t>
+      </w:r>
+      <w:r>
+        <w:t xml:space="preserve">, consistent with the forced-sale channel. We evaluate this specification at</w:t>
       </w:r>
       <w:r>
         <w:t xml:space="preserve"> </w:t>
@@ -1231,7 +1287,39 @@
         <w:t xml:space="preserve"> </w:t>
       </w:r>
       <w:r>
-        <w:t xml:space="preserve">∈ {4%, 6%} are economically motivated candidate thresholds. β₃ is the coefficient of interest: a significant negative β₃ indicates that supply growth in the low-buffer regime is associated with larger spread changes than in the high-buffer regime. Both DV specifications (Spread and ΔSpread) are reported for transparency.</w:t>
+        <w:t xml:space="preserve">∈ {10%, 12%}, reporting the</w:t>
+      </w:r>
+      <w:r>
+        <w:t xml:space="preserve"> </w:t>
+      </w:r>
+      <w:r>
+        <w:rPr>
+          <w:i/>
+          <w:iCs/>
+        </w:rPr>
+        <w:t xml:space="preserve">L</w:t>
+      </w:r>
+      <w:r>
+        <w:t xml:space="preserve"> </w:t>
+      </w:r>
+      <w:r>
+        <w:t xml:space="preserve">&lt; 12% threshold as the primary result given its larger identification cell (six low-buffer outflow observations across both issuers), and</w:t>
+      </w:r>
+      <w:r>
+        <w:t xml:space="preserve"> </w:t>
+      </w:r>
+      <w:r>
+        <w:rPr>
+          <w:i/>
+          <w:iCs/>
+        </w:rPr>
+        <w:t xml:space="preserve">L</w:t>
+      </w:r>
+      <w:r>
+        <w:t xml:space="preserve"> </w:t>
+      </w:r>
+      <w:r>
+        <w:t xml:space="preserve">&lt; 10% as a robustness check.</w:t>
       </w:r>
     </w:p>
     <w:p>
@@ -2615,13 +2703,13 @@
       </w:r>
     </w:p>
     <w:bookmarkEnd w:id="39"/>
-    <w:bookmarkStart w:id="43" w:name="threshold-panel-specification"/>
+    <w:bookmarkStart w:id="43" w:name="asymmetric-threshold-specification"/>
     <w:p>
       <w:pPr>
         <w:pStyle w:val="Heading3"/>
       </w:pPr>
       <w:r>
-        <w:t xml:space="preserve">3.3 Threshold Panel Specification</w:t>
+        <w:t xml:space="preserve">3.3 Asymmetric Threshold Specification</w:t>
       </w:r>
     </w:p>
     <w:p>
@@ -2629,20 +2717,7 @@
         <w:pStyle w:val="FirstParagraph"/>
       </w:pPr>
       <w:r>
-        <w:t xml:space="preserve">Table 3 presents the threshold results across two candidate thresholds (</w:t>
-      </w:r>
-      <w:r>
-        <w:rPr>
-          <w:i/>
-          <w:iCs/>
-        </w:rPr>
-        <w:t xml:space="preserve">c</w:t>
-      </w:r>
-      <w:r>
-        <w:t xml:space="preserve"> </w:t>
-      </w:r>
-      <w:r>
-        <w:t xml:space="preserve">= 4%, 6%) and two dependent variables (ΔSpread, Spread). The main result is in the first row: at the</w:t>
+        <w:t xml:space="preserve">The symmetric threshold regression (reported in Appendix A.5) identifies an effect concentrated at very low</w:t>
       </w:r>
       <w:r>
         <w:t xml:space="preserve"> </w:t>
@@ -2655,10 +2730,7 @@
         <w:t xml:space="preserve">L</w:t>
       </w:r>
       <w:r>
-        <w:t xml:space="preserve"> </w:t>
-      </w:r>
-      <w:r>
-        <w:t xml:space="preserve">&lt; 4% threshold in the ΔSpread specification, the interaction β₃ = −4.385 is significant at</w:t>
+        <w:t xml:space="preserve">, but the sign — spread compression in low-buffer states as supply grows — does not directly confirm the fragility channel. Supply growth in low-buffer periods reflects high-demand conditions in which both supply and spreads are moving together, not the redemption-stress scenario the theory describes. This motivates the asymmetric decomposition described in Section 2.3: separating supply</w:t>
       </w:r>
       <w:r>
         <w:t xml:space="preserve"> </w:t>
@@ -2668,13 +2740,29 @@
           <w:i/>
           <w:iCs/>
         </w:rPr>
-        <w:t xml:space="preserve">p</w:t>
-      </w:r>
-      <w:r>
-        <w:t xml:space="preserve"> </w:t>
-      </w:r>
-      <w:r>
-        <w:t xml:space="preserve">= 0.001.</w:t>
+        <w:t xml:space="preserve">inflows</w:t>
+      </w:r>
+      <w:r>
+        <w:t xml:space="preserve"> </w:t>
+      </w:r>
+      <w:r>
+        <w:t xml:space="preserve">(new issuance, requires T-bill purchases) from supply</w:t>
+      </w:r>
+      <w:r>
+        <w:t xml:space="preserve"> </w:t>
+      </w:r>
+      <w:r>
+        <w:rPr>
+          <w:i/>
+          <w:iCs/>
+        </w:rPr>
+        <w:t xml:space="preserve">outflows</w:t>
+      </w:r>
+      <w:r>
+        <w:t xml:space="preserve"> </w:t>
+      </w:r>
+      <w:r>
+        <w:t xml:space="preserve">(redemptions, may require T-bill sales) allows the data to distinguish the two regimes.</w:t>
       </w:r>
     </w:p>
     <w:p>
@@ -2682,11 +2770,19 @@
         <w:pStyle w:val="BodyText"/>
       </w:pPr>
       <w:r>
+        <w:t xml:space="preserve">Table 3 reports the asymmetric specification at the two candidate thresholds. The key coefficient throughout is β₅ on the Low × Outflow interaction.</w:t>
+      </w:r>
+    </w:p>
+    <w:p>
+      <w:pPr>
+        <w:pStyle w:val="BodyText"/>
+      </w:pPr>
+      <w:r>
         <w:rPr>
           <w:b/>
           <w:bCs/>
         </w:rPr>
-        <w:t xml:space="preserve">Table 3. Threshold Panel Regression Results</w:t>
+        <w:t xml:space="preserve">Table 3. Asymmetric Threshold Panel: Low × Outflow Specification (DV = ΔSpread)</w:t>
       </w:r>
     </w:p>
     <w:tbl>
@@ -2697,13 +2793,9 @@
         <w:tblLook w:firstRow="1" w:lastRow="0" w:firstColumn="0" w:lastColumn="0" w:noHBand="0" w:noVBand="0" w:val="0020"/>
       </w:tblPr>
       <w:tblGrid>
-        <w:gridCol w:w="1131"/>
-        <w:gridCol w:w="1131"/>
-        <w:gridCol w:w="1131"/>
-        <w:gridCol w:w="1131"/>
-        <w:gridCol w:w="1131"/>
-        <w:gridCol w:w="1131"/>
-        <w:gridCol w:w="1131"/>
+        <w:gridCol w:w="2640"/>
+        <w:gridCol w:w="2640"/>
+        <w:gridCol w:w="2640"/>
       </w:tblGrid>
       <w:tr>
         <w:trPr>
@@ -2715,52 +2807,14 @@
             <w:pPr>
               <w:pStyle w:val="Compact"/>
             </w:pPr>
-            <w:r>
-              <w:t xml:space="preserve">Threshold</w:t>
-            </w:r>
-          </w:p>
-        </w:tc>
-        <w:tc>
-          <w:tcPr/>
-          <w:p>
-            <w:pPr>
-              <w:pStyle w:val="Compact"/>
-            </w:pPr>
-            <w:r>
-              <w:t xml:space="preserve">Dep. Var.</w:t>
-            </w:r>
-          </w:p>
-        </w:tc>
-        <w:tc>
-          <w:tcPr/>
-          <w:p>
-            <w:pPr>
-              <w:pStyle w:val="Compact"/>
-            </w:pPr>
-            <w:r>
-              <w:t xml:space="preserve">β₁ (ΔlnS)</w:t>
-            </w:r>
-          </w:p>
-        </w:tc>
-        <w:tc>
-          <w:tcPr/>
-          <w:p>
-            <w:pPr>
-              <w:pStyle w:val="Compact"/>
-            </w:pPr>
-            <w:r>
-              <w:t xml:space="preserve">β₂ (</w:t>
-            </w:r>
-            <w:r>
-              <w:rPr>
-                <w:b/>
-                <w:bCs/>
-              </w:rPr>
-              <w:t xml:space="preserve">1</w:t>
-            </w:r>
-            <w:r>
-              <w:t xml:space="preserve">[</w:t>
-            </w:r>
+          </w:p>
+        </w:tc>
+        <w:tc>
+          <w:tcPr/>
+          <w:p>
+            <w:pPr>
+              <w:pStyle w:val="Compact"/>
+            </w:pPr>
             <w:r>
               <w:rPr>
                 <w:i/>
@@ -2769,39 +2823,19 @@
               <w:t xml:space="preserve">L</w:t>
             </w:r>
             <w:r>
-              <w:t xml:space="preserve">&lt;</w:t>
-            </w:r>
-            <w:r>
-              <w:rPr>
-                <w:i/>
-                <w:iCs/>
-              </w:rPr>
-              <w:t xml:space="preserve">c</w:t>
-            </w:r>
-            <w:r>
-              <w:t xml:space="preserve">])</w:t>
-            </w:r>
-          </w:p>
-        </w:tc>
-        <w:tc>
-          <w:tcPr/>
-          <w:p>
-            <w:pPr>
-              <w:pStyle w:val="Compact"/>
-            </w:pPr>
-            <w:r>
-              <w:t xml:space="preserve">β₃ (</w:t>
-            </w:r>
-            <w:r>
-              <w:rPr>
-                <w:b/>
-                <w:bCs/>
-              </w:rPr>
-              <w:t xml:space="preserve">1</w:t>
-            </w:r>
-            <w:r>
-              <w:t xml:space="preserve">[</w:t>
-            </w:r>
+              <w:t xml:space="preserve"> </w:t>
+            </w:r>
+            <w:r>
+              <w:t xml:space="preserve">&lt; 10%</w:t>
+            </w:r>
+          </w:p>
+        </w:tc>
+        <w:tc>
+          <w:tcPr/>
+          <w:p>
+            <w:pPr>
+              <w:pStyle w:val="Compact"/>
+            </w:pPr>
             <w:r>
               <w:rPr>
                 <w:i/>
@@ -2810,20 +2844,339 @@
               <w:t xml:space="preserve">L</w:t>
             </w:r>
             <w:r>
-              <w:t xml:space="preserve">&lt;</w:t>
+              <w:t xml:space="preserve"> </w:t>
+            </w:r>
+            <w:r>
+              <w:t xml:space="preserve">&lt; 12% (primary)</w:t>
+            </w:r>
+          </w:p>
+        </w:tc>
+      </w:tr>
+      <w:tr>
+        <w:tc>
+          <w:tcPr/>
+          <w:p>
+            <w:pPr>
+              <w:pStyle w:val="Compact"/>
+            </w:pPr>
+            <w:r>
+              <w:t xml:space="preserve">β₁ Inflow</w:t>
+            </w:r>
+          </w:p>
+        </w:tc>
+        <w:tc>
+          <w:tcPr/>
+          <w:p>
+            <w:pPr>
+              <w:pStyle w:val="Compact"/>
+            </w:pPr>
+            <w:r>
+              <w:t xml:space="preserve">+0.507</w:t>
+            </w:r>
+          </w:p>
+        </w:tc>
+        <w:tc>
+          <w:tcPr/>
+          <w:p>
+            <w:pPr>
+              <w:pStyle w:val="Compact"/>
+            </w:pPr>
+            <w:r>
+              <w:t xml:space="preserve">+0.518</w:t>
+            </w:r>
+          </w:p>
+        </w:tc>
+      </w:tr>
+      <w:tr>
+        <w:tc>
+          <w:tcPr/>
+          <w:p>
+            <w:pPr>
+              <w:pStyle w:val="Compact"/>
+            </w:pPr>
+            <w:r>
+              <w:t xml:space="preserve">β₂ Outflow</w:t>
+            </w:r>
+          </w:p>
+        </w:tc>
+        <w:tc>
+          <w:tcPr/>
+          <w:p>
+            <w:pPr>
+              <w:pStyle w:val="Compact"/>
+            </w:pPr>
+            <w:r>
+              <w:t xml:space="preserve">−0.043</w:t>
+            </w:r>
+          </w:p>
+        </w:tc>
+        <w:tc>
+          <w:tcPr/>
+          <w:p>
+            <w:pPr>
+              <w:pStyle w:val="Compact"/>
+            </w:pPr>
+            <w:r>
+              <w:t xml:space="preserve">−0.081</w:t>
+            </w:r>
+          </w:p>
+        </w:tc>
+      </w:tr>
+      <w:tr>
+        <w:tc>
+          <w:tcPr/>
+          <w:p>
+            <w:pPr>
+              <w:pStyle w:val="Compact"/>
+            </w:pPr>
+            <w:r>
+              <w:t xml:space="preserve">β₃ Low</w:t>
+            </w:r>
+          </w:p>
+        </w:tc>
+        <w:tc>
+          <w:tcPr/>
+          <w:p>
+            <w:pPr>
+              <w:pStyle w:val="Compact"/>
+            </w:pPr>
+            <w:r>
+              <w:t xml:space="preserve">+0.035</w:t>
+            </w:r>
+          </w:p>
+        </w:tc>
+        <w:tc>
+          <w:tcPr/>
+          <w:p>
+            <w:pPr>
+              <w:pStyle w:val="Compact"/>
+            </w:pPr>
+            <w:r>
+              <w:t xml:space="preserve">+0.008</w:t>
+            </w:r>
+          </w:p>
+        </w:tc>
+      </w:tr>
+      <w:tr>
+        <w:tc>
+          <w:tcPr/>
+          <w:p>
+            <w:pPr>
+              <w:pStyle w:val="Compact"/>
+            </w:pPr>
+            <w:r>
+              <w:t xml:space="preserve">β₄ Low × Inflow</w:t>
+            </w:r>
+          </w:p>
+        </w:tc>
+        <w:tc>
+          <w:tcPr/>
+          <w:p>
+            <w:pPr>
+              <w:pStyle w:val="Compact"/>
+            </w:pPr>
+            <w:r>
+              <w:t xml:space="preserve">−0.923</w:t>
+            </w:r>
+          </w:p>
+        </w:tc>
+        <w:tc>
+          <w:tcPr/>
+          <w:p>
+            <w:pPr>
+              <w:pStyle w:val="Compact"/>
+            </w:pPr>
+            <w:r>
+              <w:t xml:space="preserve">−0.335</w:t>
+            </w:r>
+          </w:p>
+        </w:tc>
+      </w:tr>
+      <w:tr>
+        <w:tc>
+          <w:tcPr/>
+          <w:p>
+            <w:pPr>
+              <w:pStyle w:val="Compact"/>
+            </w:pPr>
+            <w:r>
+              <w:rPr>
+                <w:b/>
+                <w:bCs/>
+              </w:rPr>
+              <w:t xml:space="preserve">β₅ Low × Outflow</w:t>
+            </w:r>
+          </w:p>
+        </w:tc>
+        <w:tc>
+          <w:tcPr/>
+          <w:p>
+            <w:pPr>
+              <w:pStyle w:val="Compact"/>
+            </w:pPr>
+            <w:r>
+              <w:rPr>
+                <w:b/>
+                <w:bCs/>
+              </w:rPr>
+              <w:t xml:space="preserve">+16.923</w:t>
+            </w:r>
+            <w:r>
+              <w:t xml:space="preserve">* (</w:t>
             </w:r>
             <w:r>
               <w:rPr>
                 <w:i/>
                 <w:iCs/>
               </w:rPr>
-              <w:t xml:space="preserve">c</w:t>
-            </w:r>
-            <w:r>
-              <w:t xml:space="preserve">]×ΔlnS)</w:t>
-            </w:r>
-          </w:p>
-        </w:tc>
+              <w:t xml:space="preserve">p</w:t>
+            </w:r>
+            <w:r>
+              <w:t xml:space="preserve"> </w:t>
+            </w:r>
+            <w:r>
+              <w:t xml:space="preserve">&lt; 0.001)**</w:t>
+            </w:r>
+          </w:p>
+        </w:tc>
+        <w:tc>
+          <w:tcPr/>
+          <w:p>
+            <w:pPr>
+              <w:pStyle w:val="Compact"/>
+            </w:pPr>
+            <w:r>
+              <w:rPr>
+                <w:b/>
+                <w:bCs/>
+              </w:rPr>
+              <w:t xml:space="preserve">+7.552</w:t>
+            </w:r>
+            <w:r>
+              <w:t xml:space="preserve">* (</w:t>
+            </w:r>
+            <w:r>
+              <w:rPr>
+                <w:i/>
+                <w:iCs/>
+              </w:rPr>
+              <w:t xml:space="preserve">p</w:t>
+            </w:r>
+            <w:r>
+              <w:t xml:space="preserve"> </w:t>
+            </w:r>
+            <w:r>
+              <w:t xml:space="preserve">= 0.065)**</w:t>
+            </w:r>
+          </w:p>
+        </w:tc>
+      </w:tr>
+      <w:tr>
+        <w:tc>
+          <w:tcPr/>
+          <w:p>
+            <w:pPr>
+              <w:pStyle w:val="Compact"/>
+            </w:pPr>
+            <w:r>
+              <w:t xml:space="preserve">VIX</w:t>
+            </w:r>
+          </w:p>
+        </w:tc>
+        <w:tc>
+          <w:tcPr/>
+          <w:p>
+            <w:pPr>
+              <w:pStyle w:val="Compact"/>
+            </w:pPr>
+            <w:r>
+              <w:t xml:space="preserve">+0.010***</w:t>
+            </w:r>
+          </w:p>
+        </w:tc>
+        <w:tc>
+          <w:tcPr/>
+          <w:p>
+            <w:pPr>
+              <w:pStyle w:val="Compact"/>
+            </w:pPr>
+            <w:r>
+              <w:t xml:space="preserve">+0.010***</w:t>
+            </w:r>
+          </w:p>
+        </w:tc>
+      </w:tr>
+      <w:tr>
+        <w:tc>
+          <w:tcPr/>
+          <w:p>
+            <w:pPr>
+              <w:pStyle w:val="Compact"/>
+            </w:pPr>
+            <w:r>
+              <w:t xml:space="preserve">ΔlnN*</w:t>
+            </w:r>
+          </w:p>
+        </w:tc>
+        <w:tc>
+          <w:tcPr/>
+          <w:p>
+            <w:pPr>
+              <w:pStyle w:val="Compact"/>
+            </w:pPr>
+            <w:r>
+              <w:t xml:space="preserve">+0.050</w:t>
+            </w:r>
+          </w:p>
+        </w:tc>
+        <w:tc>
+          <w:tcPr/>
+          <w:p>
+            <w:pPr>
+              <w:pStyle w:val="Compact"/>
+            </w:pPr>
+            <w:r>
+              <w:t xml:space="preserve">+0.084</w:t>
+            </w:r>
+          </w:p>
+        </w:tc>
+      </w:tr>
+      <w:tr>
+        <w:tc>
+          <w:tcPr/>
+          <w:p>
+            <w:pPr>
+              <w:pStyle w:val="Compact"/>
+            </w:pPr>
+            <w:r>
+              <w:t xml:space="preserve">USDT fixed effect</w:t>
+            </w:r>
+          </w:p>
+        </w:tc>
+        <w:tc>
+          <w:tcPr/>
+          <w:p>
+            <w:pPr>
+              <w:pStyle w:val="Compact"/>
+            </w:pPr>
+            <w:r>
+              <w:t xml:space="preserve">−0.009</w:t>
+            </w:r>
+          </w:p>
+        </w:tc>
+        <w:tc>
+          <w:tcPr/>
+          <w:p>
+            <w:pPr>
+              <w:pStyle w:val="Compact"/>
+            </w:pPr>
+            <w:r>
+              <w:t xml:space="preserve">+0.001</w:t>
+            </w:r>
+          </w:p>
+        </w:tc>
+      </w:tr>
+      <w:tr>
         <w:tc>
           <w:tcPr/>
           <w:p>
@@ -2846,433 +3199,95 @@
               <w:pStyle w:val="Compact"/>
             </w:pPr>
             <w:r>
+              <w:t xml:space="preserve">100</w:t>
+            </w:r>
+          </w:p>
+        </w:tc>
+        <w:tc>
+          <w:tcPr/>
+          <w:p>
+            <w:pPr>
+              <w:pStyle w:val="Compact"/>
+            </w:pPr>
+            <w:r>
+              <w:t xml:space="preserve">100</w:t>
+            </w:r>
+          </w:p>
+        </w:tc>
+      </w:tr>
+      <w:tr>
+        <w:tc>
+          <w:tcPr/>
+          <w:p>
+            <w:pPr>
+              <w:pStyle w:val="Compact"/>
+            </w:pPr>
+            <w:r>
+              <w:t xml:space="preserve">Low-buffer outflow obs</w:t>
+            </w:r>
+          </w:p>
+        </w:tc>
+        <w:tc>
+          <w:tcPr/>
+          <w:p>
+            <w:pPr>
+              <w:pStyle w:val="Compact"/>
+            </w:pPr>
+            <w:r>
+              <w:t xml:space="preserve">2</w:t>
+            </w:r>
+          </w:p>
+        </w:tc>
+        <w:tc>
+          <w:tcPr/>
+          <w:p>
+            <w:pPr>
+              <w:pStyle w:val="Compact"/>
+            </w:pPr>
+            <w:r>
+              <w:t xml:space="preserve">6</w:t>
+            </w:r>
+          </w:p>
+        </w:tc>
+      </w:tr>
+      <w:tr>
+        <w:tc>
+          <w:tcPr/>
+          <w:p>
+            <w:pPr>
+              <w:pStyle w:val="Compact"/>
+            </w:pPr>
+            <w:r>
               <w:rPr>
                 <w:i/>
                 <w:iCs/>
               </w:rPr>
-              <w:t xml:space="preserve">N</w:t>
-            </w:r>
-            <w:r>
-              <w:t xml:space="preserve">_low</w:t>
-            </w:r>
-          </w:p>
-        </w:tc>
-      </w:tr>
-      <w:tr>
-        <w:tc>
-          <w:tcPr/>
-          <w:p>
-            <w:pPr>
-              <w:pStyle w:val="Compact"/>
-            </w:pPr>
-            <w:r>
-              <w:rPr>
-                <w:i/>
-                <w:iCs/>
-              </w:rPr>
-              <w:t xml:space="preserve">L</w:t>
-            </w:r>
-            <w:r>
-              <w:t xml:space="preserve"> </w:t>
-            </w:r>
-            <w:r>
-              <w:t xml:space="preserve">&lt; 4%</w:t>
-            </w:r>
-          </w:p>
-        </w:tc>
-        <w:tc>
-          <w:tcPr/>
-          <w:p>
-            <w:pPr>
-              <w:pStyle w:val="Compact"/>
-            </w:pPr>
-            <w:r>
-              <w:rPr>
-                <w:b/>
-                <w:bCs/>
-              </w:rPr>
-              <w:t xml:space="preserve">ΔSpread</w:t>
-            </w:r>
-          </w:p>
-        </w:tc>
-        <w:tc>
-          <w:tcPr/>
-          <w:p>
-            <w:pPr>
-              <w:pStyle w:val="Compact"/>
-            </w:pPr>
-            <w:r>
-              <w:t xml:space="preserve">+0.003</w:t>
-            </w:r>
-          </w:p>
-        </w:tc>
-        <w:tc>
-          <w:tcPr/>
-          <w:p>
-            <w:pPr>
-              <w:pStyle w:val="Compact"/>
-            </w:pPr>
-            <w:r>
-              <w:t xml:space="preserve">+0.094***</w:t>
-            </w:r>
-          </w:p>
-        </w:tc>
-        <w:tc>
-          <w:tcPr/>
-          <w:p>
-            <w:pPr>
-              <w:pStyle w:val="Compact"/>
-            </w:pPr>
-            <w:r>
-              <w:rPr>
-                <w:b/>
-                <w:bCs/>
-              </w:rPr>
-              <w:t xml:space="preserve">−4.385</w:t>
-            </w:r>
-            <w:r>
-              <w:t xml:space="preserve">* (</w:t>
-            </w:r>
-            <w:r>
-              <w:rPr>
-                <w:i/>
-                <w:iCs/>
-              </w:rPr>
-              <w:t xml:space="preserve">p</w:t>
-            </w:r>
-            <w:r>
-              <w:t xml:space="preserve"> </w:t>
-            </w:r>
-            <w:r>
-              <w:t xml:space="preserve">= 0.001)**</w:t>
-            </w:r>
-          </w:p>
-        </w:tc>
-        <w:tc>
-          <w:tcPr/>
-          <w:p>
-            <w:pPr>
-              <w:pStyle w:val="Compact"/>
-            </w:pPr>
-            <w:r>
-              <w:t xml:space="preserve">100</w:t>
-            </w:r>
-          </w:p>
-        </w:tc>
-        <w:tc>
-          <w:tcPr/>
-          <w:p>
-            <w:pPr>
-              <w:pStyle w:val="Compact"/>
-            </w:pPr>
-            <w:r>
-              <w:t xml:space="preserve">9</w:t>
-            </w:r>
-          </w:p>
-        </w:tc>
-      </w:tr>
-      <w:tr>
-        <w:tc>
-          <w:tcPr/>
-          <w:p>
-            <w:pPr>
-              <w:pStyle w:val="Compact"/>
-            </w:pPr>
-            <w:r>
-              <w:rPr>
-                <w:i/>
-                <w:iCs/>
-              </w:rPr>
-              <w:t xml:space="preserve">L</w:t>
-            </w:r>
-            <w:r>
-              <w:t xml:space="preserve"> </w:t>
-            </w:r>
-            <w:r>
-              <w:t xml:space="preserve">&lt; 4%</w:t>
-            </w:r>
-          </w:p>
-        </w:tc>
-        <w:tc>
-          <w:tcPr/>
-          <w:p>
-            <w:pPr>
-              <w:pStyle w:val="Compact"/>
-            </w:pPr>
-            <w:r>
-              <w:t xml:space="preserve">Spread</w:t>
-            </w:r>
-          </w:p>
-        </w:tc>
-        <w:tc>
-          <w:tcPr/>
-          <w:p>
-            <w:pPr>
-              <w:pStyle w:val="Compact"/>
-            </w:pPr>
-            <w:r>
-              <w:t xml:space="preserve">+2.024</w:t>
-            </w:r>
-          </w:p>
-        </w:tc>
-        <w:tc>
-          <w:tcPr/>
-          <w:p>
-            <w:pPr>
-              <w:pStyle w:val="Compact"/>
-            </w:pPr>
-            <w:r>
-              <w:t xml:space="preserve">−0.480***</w:t>
-            </w:r>
-          </w:p>
-        </w:tc>
-        <w:tc>
-          <w:tcPr/>
-          <w:p>
-            <w:pPr>
-              <w:pStyle w:val="Compact"/>
-            </w:pPr>
-            <w:r>
-              <w:t xml:space="preserve">+3.224 (</w:t>
-            </w:r>
-            <w:r>
-              <w:rPr>
-                <w:i/>
-                <w:iCs/>
-              </w:rPr>
-              <w:t xml:space="preserve">p</w:t>
-            </w:r>
-            <w:r>
-              <w:t xml:space="preserve"> </w:t>
-            </w:r>
-            <w:r>
-              <w:t xml:space="preserve">= 0.309)</w:t>
-            </w:r>
-          </w:p>
-        </w:tc>
-        <w:tc>
-          <w:tcPr/>
-          <w:p>
-            <w:pPr>
-              <w:pStyle w:val="Compact"/>
-            </w:pPr>
-            <w:r>
-              <w:t xml:space="preserve">102</w:t>
-            </w:r>
-          </w:p>
-        </w:tc>
-        <w:tc>
-          <w:tcPr/>
-          <w:p>
-            <w:pPr>
-              <w:pStyle w:val="Compact"/>
-            </w:pPr>
-            <w:r>
-              <w:t xml:space="preserve">9</w:t>
-            </w:r>
-          </w:p>
-        </w:tc>
-      </w:tr>
-      <w:tr>
-        <w:tc>
-          <w:tcPr/>
-          <w:p>
-            <w:pPr>
-              <w:pStyle w:val="Compact"/>
-            </w:pPr>
-            <w:r>
-              <w:rPr>
-                <w:i/>
-                <w:iCs/>
-              </w:rPr>
-              <w:t xml:space="preserve">L</w:t>
-            </w:r>
-            <w:r>
-              <w:t xml:space="preserve"> </w:t>
-            </w:r>
-            <w:r>
-              <w:t xml:space="preserve">&lt; 6%</w:t>
-            </w:r>
-          </w:p>
-        </w:tc>
-        <w:tc>
-          <w:tcPr/>
-          <w:p>
-            <w:pPr>
-              <w:pStyle w:val="Compact"/>
-            </w:pPr>
-            <w:r>
-              <w:t xml:space="preserve">ΔSpread</w:t>
-            </w:r>
-          </w:p>
-        </w:tc>
-        <w:tc>
-          <w:tcPr/>
-          <w:p>
-            <w:pPr>
-              <w:pStyle w:val="Compact"/>
-            </w:pPr>
-            <w:r>
-              <w:t xml:space="preserve">−0.093</w:t>
-            </w:r>
-          </w:p>
-        </w:tc>
-        <w:tc>
-          <w:tcPr/>
-          <w:p>
-            <w:pPr>
-              <w:pStyle w:val="Compact"/>
-            </w:pPr>
-            <w:r>
-              <w:t xml:space="preserve">+0.036</w:t>
-            </w:r>
-          </w:p>
-        </w:tc>
-        <w:tc>
-          <w:tcPr/>
-          <w:p>
-            <w:pPr>
-              <w:pStyle w:val="Compact"/>
-            </w:pPr>
-            <w:r>
-              <w:t xml:space="preserve">−0.561 (</w:t>
-            </w:r>
-            <w:r>
-              <w:rPr>
-                <w:i/>
-                <w:iCs/>
-              </w:rPr>
-              <w:t xml:space="preserve">p</w:t>
-            </w:r>
-            <w:r>
-              <w:t xml:space="preserve"> </w:t>
-            </w:r>
-            <w:r>
-              <w:t xml:space="preserve">= 0.639)</w:t>
-            </w:r>
-          </w:p>
-        </w:tc>
-        <w:tc>
-          <w:tcPr/>
-          <w:p>
-            <w:pPr>
-              <w:pStyle w:val="Compact"/>
-            </w:pPr>
-            <w:r>
-              <w:t xml:space="preserve">100</w:t>
-            </w:r>
-          </w:p>
-        </w:tc>
-        <w:tc>
-          <w:tcPr/>
-          <w:p>
-            <w:pPr>
-              <w:pStyle w:val="Compact"/>
-            </w:pPr>
-            <w:r>
-              <w:t xml:space="preserve">23</w:t>
-            </w:r>
-          </w:p>
-        </w:tc>
-      </w:tr>
-      <w:tr>
-        <w:tc>
-          <w:tcPr/>
-          <w:p>
-            <w:pPr>
-              <w:pStyle w:val="Compact"/>
-            </w:pPr>
-            <w:r>
-              <w:rPr>
-                <w:i/>
-                <w:iCs/>
-              </w:rPr>
-              <w:t xml:space="preserve">L</w:t>
-            </w:r>
-            <w:r>
-              <w:t xml:space="preserve"> </w:t>
-            </w:r>
-            <w:r>
-              <w:t xml:space="preserve">&lt; 6%</w:t>
-            </w:r>
-          </w:p>
-        </w:tc>
-        <w:tc>
-          <w:tcPr/>
-          <w:p>
-            <w:pPr>
-              <w:pStyle w:val="Compact"/>
-            </w:pPr>
-            <w:r>
-              <w:t xml:space="preserve">Spread</w:t>
-            </w:r>
-          </w:p>
-        </w:tc>
-        <w:tc>
-          <w:tcPr/>
-          <w:p>
-            <w:pPr>
-              <w:pStyle w:val="Compact"/>
-            </w:pPr>
-            <w:r>
-              <w:t xml:space="preserve">+1.618</w:t>
-            </w:r>
-          </w:p>
-        </w:tc>
-        <w:tc>
-          <w:tcPr/>
-          <w:p>
-            <w:pPr>
-              <w:pStyle w:val="Compact"/>
-            </w:pPr>
-            <w:r>
-              <w:t xml:space="preserve">−0.643***</w:t>
-            </w:r>
-          </w:p>
-        </w:tc>
-        <w:tc>
-          <w:tcPr/>
-          <w:p>
-            <w:pPr>
-              <w:pStyle w:val="Compact"/>
-            </w:pPr>
-            <w:r>
-              <w:t xml:space="preserve">+0.561 (</w:t>
-            </w:r>
-            <w:r>
-              <w:rPr>
-                <w:i/>
-                <w:iCs/>
-              </w:rPr>
-              <w:t xml:space="preserve">p</w:t>
-            </w:r>
-            <w:r>
-              <w:t xml:space="preserve"> </w:t>
-            </w:r>
-            <w:r>
-              <w:t xml:space="preserve">= 0.620)</w:t>
-            </w:r>
-          </w:p>
-        </w:tc>
-        <w:tc>
-          <w:tcPr/>
-          <w:p>
-            <w:pPr>
-              <w:pStyle w:val="Compact"/>
-            </w:pPr>
-            <w:r>
-              <w:t xml:space="preserve">102</w:t>
-            </w:r>
-          </w:p>
-        </w:tc>
-        <w:tc>
-          <w:tcPr/>
-          <w:p>
-            <w:pPr>
-              <w:pStyle w:val="Compact"/>
-            </w:pPr>
-            <w:r>
-              <w:t xml:space="preserve">23</w:t>
+              <w:t xml:space="preserve">R</w:t>
+            </w:r>
+            <w:r>
+              <w:t xml:space="preserve">²</w:t>
+            </w:r>
+          </w:p>
+        </w:tc>
+        <w:tc>
+          <w:tcPr/>
+          <w:p>
+            <w:pPr>
+              <w:pStyle w:val="Compact"/>
+            </w:pPr>
+            <w:r>
+              <w:t xml:space="preserve">0.141</w:t>
+            </w:r>
+          </w:p>
+        </w:tc>
+        <w:tc>
+          <w:tcPr/>
+          <w:p>
+            <w:pPr>
+              <w:pStyle w:val="Compact"/>
+            </w:pPr>
+            <w:r>
+              <w:t xml:space="preserve">0.119</w:t>
             </w:r>
           </w:p>
         </w:tc>
@@ -3293,14 +3308,14 @@
         <w:t xml:space="preserve"> </w:t>
       </w:r>
       <w:r>
-        <w:t xml:space="preserve">Standard errors clustered by month. Controls: VIX, ΔlnN</w:t>
+        <w:t xml:space="preserve">DV = ΔSpread (first-differenced). Standard errors clustered by month. Controls: VIX, ΔlnN</w:t>
       </w:r>
       <w:r>
         <w:rPr>
           <w:i/>
           <w:iCs/>
         </w:rPr>
-        <w:t xml:space="preserve">, USDT dummy. ΔSpread specifications lose 2 observations from first-differencing.</w:t>
+        <w:t xml:space="preserve">, USDT issuer dummy. Low-buffer outflow obs = observations with</w:t>
       </w:r>
       <w:r>
         <w:rPr>
@@ -3310,7 +3325,23 @@
         <w:t xml:space="preserve"> </w:t>
       </w:r>
       <w:r>
-        <w:t xml:space="preserve">**</w:t>
+        <w:t xml:space="preserve">L* &lt;</w:t>
+      </w:r>
+      <w:r>
+        <w:t xml:space="preserve"> </w:t>
+      </w:r>
+      <w:r>
+        <w:rPr>
+          <w:i/>
+          <w:iCs/>
+        </w:rPr>
+        <w:t xml:space="preserve">c</w:t>
+      </w:r>
+      <w:r>
+        <w:t xml:space="preserve"> </w:t>
+      </w:r>
+      <w:r>
+        <w:t xml:space="preserve">and Outflow &gt; 0 in the regression sample. ΔSpread loses 2 observations from first-differencing (N = 100 from 102). ***</w:t>
       </w:r>
       <w:r>
         <w:t xml:space="preserve"> </w:t>
@@ -3326,7 +3357,39 @@
         <w:t xml:space="preserve"> </w:t>
       </w:r>
       <w:r>
-        <w:t xml:space="preserve">&lt; 0.01.</w:t>
+        <w:t xml:space="preserve">&lt; 0.01, **</w:t>
+      </w:r>
+      <w:r>
+        <w:t xml:space="preserve"> </w:t>
+      </w:r>
+      <w:r>
+        <w:rPr>
+          <w:i/>
+          <w:iCs/>
+        </w:rPr>
+        <w:t xml:space="preserve">p</w:t>
+      </w:r>
+      <w:r>
+        <w:t xml:space="preserve"> </w:t>
+      </w:r>
+      <w:r>
+        <w:t xml:space="preserve">&lt; 0.05, *</w:t>
+      </w:r>
+      <w:r>
+        <w:t xml:space="preserve"> </w:t>
+      </w:r>
+      <w:r>
+        <w:rPr>
+          <w:i/>
+          <w:iCs/>
+        </w:rPr>
+        <w:t xml:space="preserve">p</w:t>
+      </w:r>
+      <w:r>
+        <w:t xml:space="preserve"> </w:t>
+      </w:r>
+      <w:r>
+        <w:t xml:space="preserve">&lt; 0.10.</w:t>
       </w:r>
     </w:p>
     <w:p>
@@ -3334,7 +3397,7 @@
         <w:pStyle w:val="BodyText"/>
       </w:pPr>
       <w:r>
-        <w:t xml:space="preserve">Of the 102 panel observations, 9 have</w:t>
+        <w:t xml:space="preserve">At the</w:t>
       </w:r>
       <w:r>
         <w:t xml:space="preserve"> </w:t>
@@ -3350,7 +3413,28 @@
         <w:t xml:space="preserve"> </w:t>
       </w:r>
       <w:r>
-        <w:t xml:space="preserve">&lt; 4% and 23 have</w:t>
+        <w:t xml:space="preserve">&lt; 12% threshold — the primary specification — β₅ = +7.55 (</w:t>
+      </w:r>
+      <w:r>
+        <w:rPr>
+          <w:i/>
+          <w:iCs/>
+        </w:rPr>
+        <w:t xml:space="preserve">p</w:t>
+      </w:r>
+      <w:r>
+        <w:t xml:space="preserve"> </w:t>
+      </w:r>
+      <w:r>
+        <w:t xml:space="preserve">= 0.065), significant at the 10% level. This indicates that a one-unit increase in the monthly supply-contraction rate in a low-buffer state is associated with a 7.55 percentage-point increase in ΔSpread, consistent with the forced-sale channel: when liquid buffers are below 12%, stablecoin supply contractions are associated with increases in the T-bill-OIS spread.</w:t>
+      </w:r>
+    </w:p>
+    <w:p>
+      <w:pPr>
+        <w:pStyle w:val="BodyText"/>
+      </w:pPr>
+      <w:r>
+        <w:t xml:space="preserve">The</w:t>
       </w:r>
       <w:r>
         <w:t xml:space="preserve"> </w:t>
@@ -3366,7 +3450,23 @@
         <w:t xml:space="preserve"> </w:t>
       </w:r>
       <w:r>
-        <w:t xml:space="preserve">&lt; 6%; all low-buffer observations are from USDT, concentrated between mid-2025 and early 2026. The decline in USDT’s buffer reflects supply growth outpacing MMF holdings in dollar terms: supply grew from approximately $104 billion (Q1 2024) to $186 billion (Q4 2025) while the MMF/Term Repo buffer remained roughly flat at $5–7 billion, mechanically compressing</w:t>
+        <w:t xml:space="preserve">&lt; 10% threshold delivers a substantially larger coefficient (β₅ = +16.92,</w:t>
+      </w:r>
+      <w:r>
+        <w:t xml:space="preserve"> </w:t>
+      </w:r>
+      <w:r>
+        <w:rPr>
+          <w:i/>
+          <w:iCs/>
+        </w:rPr>
+        <w:t xml:space="preserve">p</w:t>
+      </w:r>
+      <w:r>
+        <w:t xml:space="preserve"> </w:t>
+      </w:r>
+      <w:r>
+        <w:t xml:space="preserve">&lt; 0.001), but is identified by only two low-buffer outflow observations — both from USDT in early 2026. With a single issuer and only two data points, this result cannot rule out a USDT-specific or period-specific explanation and should be treated as exploratory. The</w:t>
       </w:r>
       <w:r>
         <w:t xml:space="preserve"> </w:t>
@@ -3382,7 +3482,39 @@
         <w:t xml:space="preserve"> </w:t>
       </w:r>
       <w:r>
-        <w:t xml:space="preserve">from 6.1% to below 3%.</w:t>
+        <w:t xml:space="preserve">&lt; 12% threshold uses six low-buffer outflow observations spanning both issuers (USDT and USDC) and multiple years (2023–2026), making it the more defensible identification basis.</w:t>
+      </w:r>
+    </w:p>
+    <w:p>
+      <w:pPr>
+        <w:pStyle w:val="BodyText"/>
+      </w:pPr>
+      <w:r>
+        <w:t xml:space="preserve">Crucially, the inflow coefficients β₁ and β₄ are uniformly insignificant across both thresholds. Supply increases — which require issuers to</w:t>
+      </w:r>
+      <w:r>
+        <w:t xml:space="preserve"> </w:t>
+      </w:r>
+      <w:r>
+        <w:rPr>
+          <w:i/>
+          <w:iCs/>
+        </w:rPr>
+        <w:t xml:space="preserve">purchase</w:t>
+      </w:r>
+      <w:r>
+        <w:t xml:space="preserve"> </w:t>
+      </w:r>
+      <w:r>
+        <w:t xml:space="preserve">T-bills — do not generate significant spread effects regardless of the buffer level. The asymmetry is precisely what the forced-sale theory predicts: orderly T-bill purchases compress spreads smoothly; forced T-bill sales in depleted-buffer states generate pressure.</w:t>
+      </w:r>
+    </w:p>
+    <w:p>
+      <w:pPr>
+        <w:pStyle w:val="BodyText"/>
+      </w:pPr>
+      <w:r>
+        <w:t xml:space="preserve">The evidence is strongest when we allow for asymmetry between stablecoin inflows and outflows. Supply contractions are associated with increases in the T-bill-OIS spread when issuers have low liquid buffers, consistent with a forced-sale channel.</w:t>
       </w:r>
     </w:p>
     <w:p>
@@ -3394,7 +3526,7 @@
           <wp:inline>
             <wp:extent cx="4857750" cy="3470493"/>
             <wp:effectExtent b="0" l="0" r="0" t="0"/>
-            <wp:docPr descr="Figure 3. Threshold regime scatter: monthly supply growth ΔlnS vs. change in OIS–Treasury spread ΔSpread, colored by buffer regime. Red diamonds (L &lt; 4%, n = 9) show a steeper negative fitted slope than blue circles (L ≥ 6%, n = 77), consistent with β₃ = −4.39 in the threshold panel regression. Orange triangles are the moderate-buffer band (4% ≤ L &lt; 6%, n = 14). Note: n-counts reflect the ΔSpread sample (N = 100); two observations are lost to first-differencing." title="" id="41" name="Picture"/>
+            <wp:docPr descr="Figure 3. Supply growth (ΔlnS) versus spread change (ΔSpread), colored by buffer regime. The asymmetric pattern — outflows in low-buffer states coinciding with spread increases — is visible in the upper-left quadrant for low-buffer observations. High-buffer observations (blue circles) show no systematic relationship between supply changes and spread changes." title="" id="41" name="Picture"/>
             <a:graphic>
               <a:graphicData uri="http://schemas.openxmlformats.org/drawingml/2006/picture">
                 <pic:pic>
@@ -3447,106 +3579,7 @@
         <w:t xml:space="preserve"> </w:t>
       </w:r>
       <w:r>
-        <w:t xml:space="preserve">Threshold regime scatter: monthly supply growth ΔlnS vs. change in OIS–Treasury spread ΔSpread, colored by buffer regime. Red diamonds (L &lt; 4%, n = 9) show a steeper negative fitted slope than blue circles (L ≥ 6%, n = 77), consistent with β₃ = −4.39 in the threshold panel regression. Orange triangles are the moderate-buffer band (4% ≤ L &lt; 6%, n = 14). Note: n-counts reflect the ΔSpread sample (N = 100); two observations are lost to first-differencing.</w:t>
-      </w:r>
-    </w:p>
-    <w:p>
-      <w:pPr>
-        <w:pStyle w:val="BodyText"/>
-      </w:pPr>
-      <w:r>
-        <w:t xml:space="preserve">The</w:t>
-      </w:r>
-      <w:r>
-        <w:t xml:space="preserve"> </w:t>
-      </w:r>
-      <w:r>
-        <w:rPr>
-          <w:i/>
-          <w:iCs/>
-        </w:rPr>
-        <w:t xml:space="preserve">L</w:t>
-      </w:r>
-      <w:r>
-        <w:t xml:space="preserve"> </w:t>
-      </w:r>
-      <w:r>
-        <w:t xml:space="preserve">&lt; 4% ΔSpread result is interpretively nuanced. The negative β₃ indicates that in low-buffer states, supply growth is associated with larger spread</w:t>
-      </w:r>
-      <w:r>
-        <w:t xml:space="preserve"> </w:t>
-      </w:r>
-      <w:r>
-        <w:rPr>
-          <w:i/>
-          <w:iCs/>
-        </w:rPr>
-        <w:t xml:space="preserve">declines</w:t>
-      </w:r>
-      <w:r>
-        <w:t xml:space="preserve"> </w:t>
-      </w:r>
-      <w:r>
-        <w:t xml:space="preserve">— not the spread widening that the fragility channel predicts for a run scenario. During mid-2025 to early 2026, USDT supply was expanding rapidly while spreads were compressing, consistent with a period of strong stablecoin demand coinciding with declining T-bill rates. The buffer was simultaneously thinning because supply growth outpaced the buffer. The result therefore captures:</w:t>
-      </w:r>
-      <w:r>
-        <w:t xml:space="preserve"> </w:t>
-      </w:r>
-      <w:r>
-        <w:t xml:space="preserve">“when the buffer is thin and supply is growing, spreads fall faster.”</w:t>
-      </w:r>
-      <w:r>
-        <w:t xml:space="preserve"> </w:t>
-      </w:r>
-      <w:r>
-        <w:t xml:space="preserve">This is consistent with a high-demand regime rather than a redemption-stress regime. Importantly, the 6% threshold is not significant (</w:t>
-      </w:r>
-      <w:r>
-        <w:rPr>
-          <w:i/>
-          <w:iCs/>
-        </w:rPr>
-        <w:t xml:space="preserve">p</w:t>
-      </w:r>
-      <w:r>
-        <w:t xml:space="preserve"> </w:t>
-      </w:r>
-      <w:r>
-        <w:t xml:space="preserve">= 0.64), and the 4% threshold disappears in the levels specification (</w:t>
-      </w:r>
-      <w:r>
-        <w:rPr>
-          <w:i/>
-          <w:iCs/>
-        </w:rPr>
-        <w:t xml:space="preserve">p</w:t>
-      </w:r>
-      <w:r>
-        <w:t xml:space="preserve"> </w:t>
-      </w:r>
-      <w:r>
-        <w:t xml:space="preserve">= 0.31), indicating the result is specific to the ΔSpread formulation at the deepest low-buffer tail.</w:t>
-      </w:r>
-    </w:p>
-    <w:p>
-      <w:pPr>
-        <w:pStyle w:val="BodyText"/>
-      </w:pPr>
-      <w:r>
-        <w:t xml:space="preserve">Three caveats govern interpretation. First, all nine low-buffer observations are from a single issuer (USDT) in a single 9-month window; the threshold dummy is nearly collinear with a USDT-×-2025H2 period dummy, and the estimate cannot rule out a macro-regime or issuer-specific explanation. Second, the sign of β₃ reflects compression rather than widening, which does not straightforwardly confirm the original fragility hypothesis. Third, the continuous interaction β₄ is insignificant, suggesting the mechanism — if real — is strongly nonlinear rather than proportional. We characterize the result as</w:t>
-      </w:r>
-      <w:r>
-        <w:t xml:space="preserve"> </w:t>
-      </w:r>
-      <w:r>
-        <w:rPr>
-          <w:i/>
-          <w:iCs/>
-        </w:rPr>
-        <w:t xml:space="preserve">suggestive evidence for a nonlinear liquidity-buffer channel</w:t>
-      </w:r>
-      <w:r>
-        <w:t xml:space="preserve">, pending a longer sample with more variation in low-buffer episodes across issuers.</w:t>
+        <w:t xml:space="preserve">Supply growth (ΔlnS) versus spread change (ΔSpread), colored by buffer regime. The asymmetric pattern — outflows in low-buffer states coinciding with spread increases — is visible in the upper-left quadrant for low-buffer observations. High-buffer observations (blue circles) show no systematic relationship between supply changes and spread changes.</w:t>
       </w:r>
     </w:p>
     <w:bookmarkEnd w:id="43"/>
@@ -4009,10 +4042,7 @@
         <w:t xml:space="preserve"> </w:t>
       </w:r>
       <w:r>
-        <w:t xml:space="preserve">= 0.68), consistent with the effect being nonlinear. A threshold specification at</w:t>
-      </w:r>
-      <w:r>
-        <w:t xml:space="preserve"> </w:t>
+        <w:t xml:space="preserve">= 0.68), consistent with the effect being nonlinear. An asymmetric threshold specification — separating supply inflows from outflows — finds that supply contractions in low-buffer states (</w:t>
       </w:r>
       <w:r>
         <w:rPr>
@@ -4025,7 +4055,23 @@
         <w:t xml:space="preserve"> </w:t>
       </w:r>
       <w:r>
-        <w:t xml:space="preserve">&lt; 4% finds a significant interaction with ΔSpread (β₃ = −4.39,</w:t>
+        <w:t xml:space="preserve">&lt; 12%) are associated with spread</w:t>
+      </w:r>
+      <w:r>
+        <w:t xml:space="preserve"> </w:t>
+      </w:r>
+      <w:r>
+        <w:rPr>
+          <w:i/>
+          <w:iCs/>
+        </w:rPr>
+        <w:t xml:space="preserve">increases</w:t>
+      </w:r>
+      <w:r>
+        <w:t xml:space="preserve"> </w:t>
+      </w:r>
+      <w:r>
+        <w:t xml:space="preserve">(β₅ = +7.55,</w:t>
       </w:r>
       <w:r>
         <w:t xml:space="preserve"> </w:t>
@@ -4041,7 +4087,7 @@
         <w:t xml:space="preserve"> </w:t>
       </w:r>
       <w:r>
-        <w:t xml:space="preserve">= 0.001), concentrated in nine USDT observations in mid-2025 to early 2026.</w:t>
+        <w:t xml:space="preserve">= 0.065), identified by six low-buffer outflow observations spanning both issuers. The inflow coefficient is uniformly insignificant, consistent with the asymmetric prediction that only forced T-bill sales, triggered by outflows when buffers are depleted, generate spread pressure.</w:t>
       </w:r>
     </w:p>
     <w:p>
@@ -4049,7 +4095,36 @@
         <w:pStyle w:val="BodyText"/>
       </w:pPr>
       <w:r>
-        <w:t xml:space="preserve">Three limitations constrain the strength of this conclusion. The significant result is identified from a single issuer in a single macroeconomic window; the sign of the significant coefficient reflects spread compression rather than widening, making its interpretation as evidence of fragility indirect; and the non-stationarity of the level spread precludes straightforward inference from the continuous-L levels specification.</w:t>
+        <w:t xml:space="preserve">Two limitations constrain the strength of this conclusion. The significant result rests on only six identifying observations, and the non-stationarity of the level spread precludes straightforward inference from the continuous-</w:t>
+      </w:r>
+      <w:r>
+        <w:rPr>
+          <w:i/>
+          <w:iCs/>
+        </w:rPr>
+        <w:t xml:space="preserve">L</w:t>
+      </w:r>
+      <w:r>
+        <w:t xml:space="preserve"> </w:t>
+      </w:r>
+      <w:r>
+        <w:t xml:space="preserve">levels specification. The</w:t>
+      </w:r>
+      <w:r>
+        <w:t xml:space="preserve"> </w:t>
+      </w:r>
+      <w:r>
+        <w:rPr>
+          <w:i/>
+          <w:iCs/>
+        </w:rPr>
+        <w:t xml:space="preserve">L</w:t>
+      </w:r>
+      <w:r>
+        <w:t xml:space="preserve"> </w:t>
+      </w:r>
+      <w:r>
+        <w:t xml:space="preserve">&lt; 10% robustness produces a larger coefficient (β₅ = +16.92) but is identified by only two observations, underscoring the need for additional data.</w:t>
       </w:r>
     </w:p>
     <w:p>
@@ -4644,7 +4719,7 @@
       </w:r>
     </w:p>
     <w:bookmarkEnd w:id="50"/>
-    <w:bookmarkStart w:id="56" w:name="appendix"/>
+    <w:bookmarkStart w:id="57" w:name="appendix"/>
     <w:p>
       <w:pPr>
         <w:pStyle w:val="Heading2"/>
@@ -6141,13 +6216,13 @@
       </w:r>
     </w:p>
     <w:bookmarkEnd w:id="54"/>
-    <w:bookmarkStart w:id="55" w:name="Xe024b2afd9dd10234797a2c3bcba675514f7e3d"/>
+    <w:bookmarkStart w:id="55" w:name="X52eed1d9952e72e1503c7ce3a8ff6983459137a"/>
     <w:p>
       <w:pPr>
         <w:pStyle w:val="Heading3"/>
       </w:pPr>
       <w:r>
-        <w:t xml:space="preserve">A.5 Event Study: Normal Model and Placebo Design</w:t>
+        <w:t xml:space="preserve">A.5 Symmetric Threshold Specification (Exploratory)</w:t>
       </w:r>
     </w:p>
     <w:p>
@@ -6155,12 +6230,749 @@
         <w:pStyle w:val="FirstParagraph"/>
       </w:pPr>
       <w:r>
-        <w:t xml:space="preserve">The normal model is Δspread*_d* = α + γ₁·ΔVIX*_d* + γ₂·ΔlnN**_d* + ε*_d*, estimated over the pre-event window [−120, −6] trading days via OLS. The original level-model specification inflated CARs approximately 120-fold by including the 2022 hiking trend in the estimation window; first-differencing corrects this. Event window: [−5, +20] trading days. Placebo pseudo-events: October 2022, June 2023, September 2024 — chosen as low-volatility periods with no major stablecoin or monetary policy news.</w:t>
+        <w:t xml:space="preserve">For reference, the symmetric threshold specification — which does not distinguish inflows from outflows — is reported below. The main result (β₃ = −4.385 at</w:t>
+      </w:r>
+      <w:r>
+        <w:t xml:space="preserve"> </w:t>
+      </w:r>
+      <w:r>
+        <w:rPr>
+          <w:i/>
+          <w:iCs/>
+        </w:rPr>
+        <w:t xml:space="preserve">L</w:t>
+      </w:r>
+      <w:r>
+        <w:t xml:space="preserve"> </w:t>
+      </w:r>
+      <w:r>
+        <w:t xml:space="preserve">&lt; 4%,</w:t>
+      </w:r>
+      <w:r>
+        <w:t xml:space="preserve"> </w:t>
+      </w:r>
+      <w:r>
+        <w:rPr>
+          <w:i/>
+          <w:iCs/>
+        </w:rPr>
+        <w:t xml:space="preserve">p</w:t>
+      </w:r>
+      <w:r>
+        <w:t xml:space="preserve"> </w:t>
+      </w:r>
+      <w:r>
+        <w:t xml:space="preserve">= 0.001) motivated the asymmetric decomposition in Section 3.3, but is interpretively limited: the negative sign reflects spread</w:t>
+      </w:r>
+      <w:r>
+        <w:t xml:space="preserve"> </w:t>
+      </w:r>
+      <w:r>
+        <w:rPr>
+          <w:i/>
+          <w:iCs/>
+        </w:rPr>
+        <w:t xml:space="preserve">compression</w:t>
+      </w:r>
+      <w:r>
+        <w:t xml:space="preserve"> </w:t>
+      </w:r>
+      <w:r>
+        <w:t xml:space="preserve">when supply is growing in low-buffer periods, not the spread</w:t>
+      </w:r>
+      <w:r>
+        <w:t xml:space="preserve"> </w:t>
+      </w:r>
+      <w:r>
+        <w:rPr>
+          <w:i/>
+          <w:iCs/>
+        </w:rPr>
+        <w:t xml:space="preserve">widening</w:t>
+      </w:r>
+      <w:r>
+        <w:t xml:space="preserve"> </w:t>
+      </w:r>
+      <w:r>
+        <w:t xml:space="preserve">the fragility channel predicts for a redemption scenario. All nine low-buffer observations are from USDT in a single window (mid-2025 to early 2026), and the result disappears at the 6% threshold (</w:t>
+      </w:r>
+      <w:r>
+        <w:rPr>
+          <w:i/>
+          <w:iCs/>
+        </w:rPr>
+        <w:t xml:space="preserve">p</w:t>
+      </w:r>
+      <w:r>
+        <w:t xml:space="preserve"> </w:t>
+      </w:r>
+      <w:r>
+        <w:t xml:space="preserve">= 0.64) and in the levels specification (</w:t>
+      </w:r>
+      <w:r>
+        <w:rPr>
+          <w:i/>
+          <w:iCs/>
+        </w:rPr>
+        <w:t xml:space="preserve">p</w:t>
+      </w:r>
+      <w:r>
+        <w:t xml:space="preserve"> </w:t>
+      </w:r>
+      <w:r>
+        <w:t xml:space="preserve">= 0.31).</w:t>
+      </w:r>
+    </w:p>
+    <w:tbl>
+      <w:tblPr>
+        <w:tblStyle w:val="Table"/>
+        <w:tblW w:type="pct" w:w="5000"/>
+        <w:tblLayout w:type="fixed"/>
+        <w:tblLook w:firstRow="1" w:lastRow="0" w:firstColumn="0" w:lastColumn="0" w:noHBand="0" w:noVBand="0" w:val="0020"/>
+      </w:tblPr>
+      <w:tblGrid>
+        <w:gridCol w:w="1131"/>
+        <w:gridCol w:w="1131"/>
+        <w:gridCol w:w="1131"/>
+        <w:gridCol w:w="1131"/>
+        <w:gridCol w:w="1131"/>
+        <w:gridCol w:w="1131"/>
+        <w:gridCol w:w="1131"/>
+      </w:tblGrid>
+      <w:tr>
+        <w:trPr>
+          <w:tblHeader w:val="on"/>
+        </w:trPr>
+        <w:tc>
+          <w:tcPr/>
+          <w:p>
+            <w:pPr>
+              <w:pStyle w:val="Compact"/>
+            </w:pPr>
+            <w:r>
+              <w:t xml:space="preserve">Threshold</w:t>
+            </w:r>
+          </w:p>
+        </w:tc>
+        <w:tc>
+          <w:tcPr/>
+          <w:p>
+            <w:pPr>
+              <w:pStyle w:val="Compact"/>
+            </w:pPr>
+            <w:r>
+              <w:t xml:space="preserve">Dep. Var.</w:t>
+            </w:r>
+          </w:p>
+        </w:tc>
+        <w:tc>
+          <w:tcPr/>
+          <w:p>
+            <w:pPr>
+              <w:pStyle w:val="Compact"/>
+            </w:pPr>
+            <w:r>
+              <w:t xml:space="preserve">β₁ (ΔlnS)</w:t>
+            </w:r>
+          </w:p>
+        </w:tc>
+        <w:tc>
+          <w:tcPr/>
+          <w:p>
+            <w:pPr>
+              <w:pStyle w:val="Compact"/>
+            </w:pPr>
+            <w:r>
+              <w:t xml:space="preserve">β₂ (</w:t>
+            </w:r>
+            <w:r>
+              <w:rPr>
+                <w:b/>
+                <w:bCs/>
+              </w:rPr>
+              <w:t xml:space="preserve">1</w:t>
+            </w:r>
+            <w:r>
+              <w:t xml:space="preserve">[</w:t>
+            </w:r>
+            <w:r>
+              <w:rPr>
+                <w:i/>
+                <w:iCs/>
+              </w:rPr>
+              <w:t xml:space="preserve">L</w:t>
+            </w:r>
+            <w:r>
+              <w:t xml:space="preserve">&lt;</w:t>
+            </w:r>
+            <w:r>
+              <w:rPr>
+                <w:i/>
+                <w:iCs/>
+              </w:rPr>
+              <w:t xml:space="preserve">c</w:t>
+            </w:r>
+            <w:r>
+              <w:t xml:space="preserve">])</w:t>
+            </w:r>
+          </w:p>
+        </w:tc>
+        <w:tc>
+          <w:tcPr/>
+          <w:p>
+            <w:pPr>
+              <w:pStyle w:val="Compact"/>
+            </w:pPr>
+            <w:r>
+              <w:t xml:space="preserve">β₃ (</w:t>
+            </w:r>
+            <w:r>
+              <w:rPr>
+                <w:b/>
+                <w:bCs/>
+              </w:rPr>
+              <w:t xml:space="preserve">1</w:t>
+            </w:r>
+            <w:r>
+              <w:t xml:space="preserve">[</w:t>
+            </w:r>
+            <w:r>
+              <w:rPr>
+                <w:i/>
+                <w:iCs/>
+              </w:rPr>
+              <w:t xml:space="preserve">L</w:t>
+            </w:r>
+            <w:r>
+              <w:t xml:space="preserve">&lt;</w:t>
+            </w:r>
+            <w:r>
+              <w:rPr>
+                <w:i/>
+                <w:iCs/>
+              </w:rPr>
+              <w:t xml:space="preserve">c</w:t>
+            </w:r>
+            <w:r>
+              <w:t xml:space="preserve">]×ΔlnS)</w:t>
+            </w:r>
+          </w:p>
+        </w:tc>
+        <w:tc>
+          <w:tcPr/>
+          <w:p>
+            <w:pPr>
+              <w:pStyle w:val="Compact"/>
+            </w:pPr>
+            <w:r>
+              <w:rPr>
+                <w:i/>
+                <w:iCs/>
+              </w:rPr>
+              <w:t xml:space="preserve">N</w:t>
+            </w:r>
+          </w:p>
+        </w:tc>
+        <w:tc>
+          <w:tcPr/>
+          <w:p>
+            <w:pPr>
+              <w:pStyle w:val="Compact"/>
+            </w:pPr>
+            <w:r>
+              <w:rPr>
+                <w:i/>
+                <w:iCs/>
+              </w:rPr>
+              <w:t xml:space="preserve">N</w:t>
+            </w:r>
+            <w:r>
+              <w:t xml:space="preserve">_low</w:t>
+            </w:r>
+          </w:p>
+        </w:tc>
+      </w:tr>
+      <w:tr>
+        <w:tc>
+          <w:tcPr/>
+          <w:p>
+            <w:pPr>
+              <w:pStyle w:val="Compact"/>
+            </w:pPr>
+            <w:r>
+              <w:rPr>
+                <w:i/>
+                <w:iCs/>
+              </w:rPr>
+              <w:t xml:space="preserve">L</w:t>
+            </w:r>
+            <w:r>
+              <w:t xml:space="preserve"> </w:t>
+            </w:r>
+            <w:r>
+              <w:t xml:space="preserve">&lt; 4%</w:t>
+            </w:r>
+          </w:p>
+        </w:tc>
+        <w:tc>
+          <w:tcPr/>
+          <w:p>
+            <w:pPr>
+              <w:pStyle w:val="Compact"/>
+            </w:pPr>
+            <w:r>
+              <w:t xml:space="preserve">ΔSpread</w:t>
+            </w:r>
+          </w:p>
+        </w:tc>
+        <w:tc>
+          <w:tcPr/>
+          <w:p>
+            <w:pPr>
+              <w:pStyle w:val="Compact"/>
+            </w:pPr>
+            <w:r>
+              <w:t xml:space="preserve">+0.003</w:t>
+            </w:r>
+          </w:p>
+        </w:tc>
+        <w:tc>
+          <w:tcPr/>
+          <w:p>
+            <w:pPr>
+              <w:pStyle w:val="Compact"/>
+            </w:pPr>
+            <w:r>
+              <w:t xml:space="preserve">+0.094***</w:t>
+            </w:r>
+          </w:p>
+        </w:tc>
+        <w:tc>
+          <w:tcPr/>
+          <w:p>
+            <w:pPr>
+              <w:pStyle w:val="Compact"/>
+            </w:pPr>
+            <w:r>
+              <w:t xml:space="preserve">−4.385*** (</w:t>
+            </w:r>
+            <w:r>
+              <w:rPr>
+                <w:i/>
+                <w:iCs/>
+              </w:rPr>
+              <w:t xml:space="preserve">p</w:t>
+            </w:r>
+            <w:r>
+              <w:t xml:space="preserve"> </w:t>
+            </w:r>
+            <w:r>
+              <w:t xml:space="preserve">= 0.001)</w:t>
+            </w:r>
+          </w:p>
+        </w:tc>
+        <w:tc>
+          <w:tcPr/>
+          <w:p>
+            <w:pPr>
+              <w:pStyle w:val="Compact"/>
+            </w:pPr>
+            <w:r>
+              <w:t xml:space="preserve">100</w:t>
+            </w:r>
+          </w:p>
+        </w:tc>
+        <w:tc>
+          <w:tcPr/>
+          <w:p>
+            <w:pPr>
+              <w:pStyle w:val="Compact"/>
+            </w:pPr>
+            <w:r>
+              <w:t xml:space="preserve">9</w:t>
+            </w:r>
+          </w:p>
+        </w:tc>
+      </w:tr>
+      <w:tr>
+        <w:tc>
+          <w:tcPr/>
+          <w:p>
+            <w:pPr>
+              <w:pStyle w:val="Compact"/>
+            </w:pPr>
+            <w:r>
+              <w:rPr>
+                <w:i/>
+                <w:iCs/>
+              </w:rPr>
+              <w:t xml:space="preserve">L</w:t>
+            </w:r>
+            <w:r>
+              <w:t xml:space="preserve"> </w:t>
+            </w:r>
+            <w:r>
+              <w:t xml:space="preserve">&lt; 4%</w:t>
+            </w:r>
+          </w:p>
+        </w:tc>
+        <w:tc>
+          <w:tcPr/>
+          <w:p>
+            <w:pPr>
+              <w:pStyle w:val="Compact"/>
+            </w:pPr>
+            <w:r>
+              <w:t xml:space="preserve">Spread</w:t>
+            </w:r>
+          </w:p>
+        </w:tc>
+        <w:tc>
+          <w:tcPr/>
+          <w:p>
+            <w:pPr>
+              <w:pStyle w:val="Compact"/>
+            </w:pPr>
+            <w:r>
+              <w:t xml:space="preserve">+2.024</w:t>
+            </w:r>
+          </w:p>
+        </w:tc>
+        <w:tc>
+          <w:tcPr/>
+          <w:p>
+            <w:pPr>
+              <w:pStyle w:val="Compact"/>
+            </w:pPr>
+            <w:r>
+              <w:t xml:space="preserve">−0.480***</w:t>
+            </w:r>
+          </w:p>
+        </w:tc>
+        <w:tc>
+          <w:tcPr/>
+          <w:p>
+            <w:pPr>
+              <w:pStyle w:val="Compact"/>
+            </w:pPr>
+            <w:r>
+              <w:t xml:space="preserve">+3.224 (</w:t>
+            </w:r>
+            <w:r>
+              <w:rPr>
+                <w:i/>
+                <w:iCs/>
+              </w:rPr>
+              <w:t xml:space="preserve">p</w:t>
+            </w:r>
+            <w:r>
+              <w:t xml:space="preserve"> </w:t>
+            </w:r>
+            <w:r>
+              <w:t xml:space="preserve">= 0.309)</w:t>
+            </w:r>
+          </w:p>
+        </w:tc>
+        <w:tc>
+          <w:tcPr/>
+          <w:p>
+            <w:pPr>
+              <w:pStyle w:val="Compact"/>
+            </w:pPr>
+            <w:r>
+              <w:t xml:space="preserve">102</w:t>
+            </w:r>
+          </w:p>
+        </w:tc>
+        <w:tc>
+          <w:tcPr/>
+          <w:p>
+            <w:pPr>
+              <w:pStyle w:val="Compact"/>
+            </w:pPr>
+            <w:r>
+              <w:t xml:space="preserve">9</w:t>
+            </w:r>
+          </w:p>
+        </w:tc>
+      </w:tr>
+      <w:tr>
+        <w:tc>
+          <w:tcPr/>
+          <w:p>
+            <w:pPr>
+              <w:pStyle w:val="Compact"/>
+            </w:pPr>
+            <w:r>
+              <w:rPr>
+                <w:i/>
+                <w:iCs/>
+              </w:rPr>
+              <w:t xml:space="preserve">L</w:t>
+            </w:r>
+            <w:r>
+              <w:t xml:space="preserve"> </w:t>
+            </w:r>
+            <w:r>
+              <w:t xml:space="preserve">&lt; 6%</w:t>
+            </w:r>
+          </w:p>
+        </w:tc>
+        <w:tc>
+          <w:tcPr/>
+          <w:p>
+            <w:pPr>
+              <w:pStyle w:val="Compact"/>
+            </w:pPr>
+            <w:r>
+              <w:t xml:space="preserve">ΔSpread</w:t>
+            </w:r>
+          </w:p>
+        </w:tc>
+        <w:tc>
+          <w:tcPr/>
+          <w:p>
+            <w:pPr>
+              <w:pStyle w:val="Compact"/>
+            </w:pPr>
+            <w:r>
+              <w:t xml:space="preserve">−0.093</w:t>
+            </w:r>
+          </w:p>
+        </w:tc>
+        <w:tc>
+          <w:tcPr/>
+          <w:p>
+            <w:pPr>
+              <w:pStyle w:val="Compact"/>
+            </w:pPr>
+            <w:r>
+              <w:t xml:space="preserve">+0.036</w:t>
+            </w:r>
+          </w:p>
+        </w:tc>
+        <w:tc>
+          <w:tcPr/>
+          <w:p>
+            <w:pPr>
+              <w:pStyle w:val="Compact"/>
+            </w:pPr>
+            <w:r>
+              <w:t xml:space="preserve">−0.561 (</w:t>
+            </w:r>
+            <w:r>
+              <w:rPr>
+                <w:i/>
+                <w:iCs/>
+              </w:rPr>
+              <w:t xml:space="preserve">p</w:t>
+            </w:r>
+            <w:r>
+              <w:t xml:space="preserve"> </w:t>
+            </w:r>
+            <w:r>
+              <w:t xml:space="preserve">= 0.639)</w:t>
+            </w:r>
+          </w:p>
+        </w:tc>
+        <w:tc>
+          <w:tcPr/>
+          <w:p>
+            <w:pPr>
+              <w:pStyle w:val="Compact"/>
+            </w:pPr>
+            <w:r>
+              <w:t xml:space="preserve">100</w:t>
+            </w:r>
+          </w:p>
+        </w:tc>
+        <w:tc>
+          <w:tcPr/>
+          <w:p>
+            <w:pPr>
+              <w:pStyle w:val="Compact"/>
+            </w:pPr>
+            <w:r>
+              <w:t xml:space="preserve">23</w:t>
+            </w:r>
+          </w:p>
+        </w:tc>
+      </w:tr>
+      <w:tr>
+        <w:tc>
+          <w:tcPr/>
+          <w:p>
+            <w:pPr>
+              <w:pStyle w:val="Compact"/>
+            </w:pPr>
+            <w:r>
+              <w:rPr>
+                <w:i/>
+                <w:iCs/>
+              </w:rPr>
+              <w:t xml:space="preserve">L</w:t>
+            </w:r>
+            <w:r>
+              <w:t xml:space="preserve"> </w:t>
+            </w:r>
+            <w:r>
+              <w:t xml:space="preserve">&lt; 6%</w:t>
+            </w:r>
+          </w:p>
+        </w:tc>
+        <w:tc>
+          <w:tcPr/>
+          <w:p>
+            <w:pPr>
+              <w:pStyle w:val="Compact"/>
+            </w:pPr>
+            <w:r>
+              <w:t xml:space="preserve">Spread</w:t>
+            </w:r>
+          </w:p>
+        </w:tc>
+        <w:tc>
+          <w:tcPr/>
+          <w:p>
+            <w:pPr>
+              <w:pStyle w:val="Compact"/>
+            </w:pPr>
+            <w:r>
+              <w:t xml:space="preserve">+1.618</w:t>
+            </w:r>
+          </w:p>
+        </w:tc>
+        <w:tc>
+          <w:tcPr/>
+          <w:p>
+            <w:pPr>
+              <w:pStyle w:val="Compact"/>
+            </w:pPr>
+            <w:r>
+              <w:t xml:space="preserve">−0.643***</w:t>
+            </w:r>
+          </w:p>
+        </w:tc>
+        <w:tc>
+          <w:tcPr/>
+          <w:p>
+            <w:pPr>
+              <w:pStyle w:val="Compact"/>
+            </w:pPr>
+            <w:r>
+              <w:t xml:space="preserve">+0.561 (</w:t>
+            </w:r>
+            <w:r>
+              <w:rPr>
+                <w:i/>
+                <w:iCs/>
+              </w:rPr>
+              <w:t xml:space="preserve">p</w:t>
+            </w:r>
+            <w:r>
+              <w:t xml:space="preserve"> </w:t>
+            </w:r>
+            <w:r>
+              <w:t xml:space="preserve">= 0.620)</w:t>
+            </w:r>
+          </w:p>
+        </w:tc>
+        <w:tc>
+          <w:tcPr/>
+          <w:p>
+            <w:pPr>
+              <w:pStyle w:val="Compact"/>
+            </w:pPr>
+            <w:r>
+              <w:t xml:space="preserve">102</w:t>
+            </w:r>
+          </w:p>
+        </w:tc>
+        <w:tc>
+          <w:tcPr/>
+          <w:p>
+            <w:pPr>
+              <w:pStyle w:val="Compact"/>
+            </w:pPr>
+            <w:r>
+              <w:t xml:space="preserve">23</w:t>
+            </w:r>
+          </w:p>
+        </w:tc>
+      </w:tr>
+    </w:tbl>
+    <w:p>
+      <w:pPr>
+        <w:pStyle w:val="BodyText"/>
+      </w:pPr>
+      <w:r>
+        <w:rPr>
+          <w:i/>
+          <w:iCs/>
+        </w:rPr>
+        <w:t xml:space="preserve">Note.</w:t>
+      </w:r>
+      <w:r>
+        <w:t xml:space="preserve"> </w:t>
+      </w:r>
+      <w:r>
+        <w:t xml:space="preserve">SE clustered by month. Controls: VIX, ΔlnN</w:t>
+      </w:r>
+      <w:r>
+        <w:rPr>
+          <w:i/>
+          <w:iCs/>
+        </w:rPr>
+        <w:t xml:space="preserve">, USDT dummy.</w:t>
+      </w:r>
+      <w:r>
+        <w:rPr>
+          <w:i/>
+          <w:iCs/>
+        </w:rPr>
+        <w:t xml:space="preserve"> </w:t>
+      </w:r>
+      <w:r>
+        <w:t xml:space="preserve">**</w:t>
+      </w:r>
+      <w:r>
+        <w:t xml:space="preserve"> </w:t>
+      </w:r>
+      <w:r>
+        <w:rPr>
+          <w:i/>
+          <w:iCs/>
+        </w:rPr>
+        <w:t xml:space="preserve">p</w:t>
+      </w:r>
+      <w:r>
+        <w:t xml:space="preserve"> </w:t>
+      </w:r>
+      <w:r>
+        <w:t xml:space="preserve">&lt; 0.01.</w:t>
       </w:r>
     </w:p>
     <w:bookmarkEnd w:id="55"/>
+    <w:bookmarkStart w:id="56" w:name="Xb22b41e02d315b050280feb5b8156d956e76369"/>
+    <w:p>
+      <w:pPr>
+        <w:pStyle w:val="Heading3"/>
+      </w:pPr>
+      <w:r>
+        <w:t xml:space="preserve">A.6 Event Study: Normal Model and Placebo Design</w:t>
+      </w:r>
+    </w:p>
+    <w:p>
+      <w:pPr>
+        <w:pStyle w:val="FirstParagraph"/>
+      </w:pPr>
+      <w:r>
+        <w:t xml:space="preserve">The normal model is Δspread*_d* = α + γ₁·ΔVIX*_d* + γ₂·ΔlnN**_d* + ε*_d*, estimated over the pre-event window [−120, −6] trading days via OLS. The original level-model specification inflated CARs approximately 120-fold by including the 2022 hiking trend in the estimation window; first-differencing corrects this. Event window: [−5, +20] trading days. Placebo pseudo-events: October 2022, June 2023, September 2024 — chosen as low-volatility periods with no major stablecoin or monetary policy news.</w:t>
+      </w:r>
+    </w:p>
     <w:bookmarkEnd w:id="56"/>
     <w:bookmarkEnd w:id="57"/>
+    <w:bookmarkEnd w:id="58"/>
     <w:sectPr>
       <w:pgSz w:h="16838" w:w="11906"/>
       <w:pgMar w:bottom="1417" w:footer="720" w:gutter="0" w:header="720" w:left="1701" w:right="1701" w:top="1417"/>

</xml_diff>

<commit_message>
Added as Appendix A.6
</commit_message>
<xml_diff>
--- a/0621_Final_Draft_for_Submission.docx
+++ b/0621_Final_Draft_for_Submission.docx
@@ -2,7 +2,7 @@
 <file path=word/document.xml><?xml version="1.0" encoding="utf-8"?>
 <w:document xmlns:w="http://schemas.openxmlformats.org/wordprocessingml/2006/main" xmlns:m="http://schemas.openxmlformats.org/officeDocument/2006/math" xmlns:r="http://schemas.openxmlformats.org/officeDocument/2006/relationships" xmlns:o="urn:schemas-microsoft-com:office:office" xmlns:v="urn:schemas-microsoft-com:vml" xmlns:w10="urn:schemas-microsoft-com:office:word" xmlns:a="http://schemas.openxmlformats.org/drawingml/2006/main" xmlns:pic="http://schemas.openxmlformats.org/drawingml/2006/picture" xmlns:wp="http://schemas.openxmlformats.org/drawingml/2006/wordprocessingDrawing">
   <w:body>
-    <w:bookmarkStart w:id="58" w:name="Xbd7829e55a55d532380878ab97c04e746e1ea0c"/>
+    <w:bookmarkStart w:id="59" w:name="Xbd7829e55a55d532380878ab97c04e746e1ea0c"/>
     <w:p>
       <w:pPr>
         <w:pStyle w:val="Heading1"/>
@@ -3519,6 +3519,72 @@
     </w:p>
     <w:p>
       <w:pPr>
+        <w:pStyle w:val="BodyText"/>
+      </w:pPr>
+      <w:r>
+        <w:t xml:space="preserve">As a robustness check, replacing the binary Low indicator with the continuous interaction</w:t>
+      </w:r>
+      <w:r>
+        <w:t xml:space="preserve"> </w:t>
+      </w:r>
+      <w:r>
+        <w:rPr>
+          <w:i/>
+          <w:iCs/>
+        </w:rPr>
+        <w:t xml:space="preserve">L</w:t>
+      </w:r>
+      <w:r>
+        <w:t xml:space="preserve"> </w:t>
+      </w:r>
+      <w:r>
+        <w:t xml:space="preserve">× Outflow yields β₅ = −18.58 (</w:t>
+      </w:r>
+      <w:r>
+        <w:rPr>
+          <w:i/>
+          <w:iCs/>
+        </w:rPr>
+        <w:t xml:space="preserve">p</w:t>
+      </w:r>
+      <w:r>
+        <w:t xml:space="preserve"> </w:t>
+      </w:r>
+      <w:r>
+        <w:t xml:space="preserve">= 0.120), consistent in sign with the forced-sale channel but less precisely estimated (Appendix A.6). The continuous specification implies that the outflow effect approaches zero as the buffer rises above approximately 20% — consistent with USDT’s ability to absorb the May 2022 redemption wave ($10bn+) without T-bill sales when</w:t>
+      </w:r>
+      <w:r>
+        <w:t xml:space="preserve"> </w:t>
+      </w:r>
+      <w:r>
+        <w:rPr>
+          <w:i/>
+          <w:iCs/>
+        </w:rPr>
+        <w:t xml:space="preserve">L</w:t>
+      </w:r>
+      <w:r>
+        <w:t xml:space="preserve"> </w:t>
+      </w:r>
+      <w:r>
+        <w:t xml:space="preserve">≈ 16%. The weaker statistical performance relative to the threshold specification is expected when the true relationship is concentrated at low buffer values rather than proportional across the full range of</w:t>
+      </w:r>
+      <w:r>
+        <w:t xml:space="preserve"> </w:t>
+      </w:r>
+      <w:r>
+        <w:rPr>
+          <w:i/>
+          <w:iCs/>
+        </w:rPr>
+        <w:t xml:space="preserve">L</w:t>
+      </w:r>
+      <w:r>
+        <w:t xml:space="preserve">.</w:t>
+      </w:r>
+    </w:p>
+    <w:p>
+      <w:pPr>
         <w:pStyle w:val="CaptionedFigure"/>
       </w:pPr>
       <w:r>
@@ -4719,7 +4785,7 @@
       </w:r>
     </w:p>
     <w:bookmarkEnd w:id="50"/>
-    <w:bookmarkStart w:id="57" w:name="appendix"/>
+    <w:bookmarkStart w:id="58" w:name="appendix"/>
     <w:p>
       <w:pPr>
         <w:pStyle w:val="Heading2"/>
@@ -6953,13 +7019,13 @@
       </w:r>
     </w:p>
     <w:bookmarkEnd w:id="55"/>
-    <w:bookmarkStart w:id="56" w:name="Xb22b41e02d315b050280feb5b8156d956e76369"/>
+    <w:bookmarkStart w:id="56" w:name="X94dc3b351eff512580e808848143fd8f68abd3c"/>
     <w:p>
       <w:pPr>
         <w:pStyle w:val="Heading3"/>
       </w:pPr>
       <w:r>
-        <w:t xml:space="preserve">A.6 Event Study: Normal Model and Placebo Design</w:t>
+        <w:t xml:space="preserve">A.6 Continuous-L Asymmetric Robustness Check</w:t>
       </w:r>
     </w:p>
     <w:p>
@@ -6967,12 +7033,740 @@
         <w:pStyle w:val="FirstParagraph"/>
       </w:pPr>
       <w:r>
-        <w:t xml:space="preserve">The normal model is Δspread*_d* = α + γ₁·ΔVIX*_d* + γ₂·ΔlnN**_d* + ε*_d*, estimated over the pre-event window [−120, −6] trading days via OLS. The original level-model specification inflated CARs approximately 120-fold by including the 2022 hiking trend in the estimation window; first-differencing corrects this. Event window: [−5, +20] trading days. Placebo pseudo-events: October 2022, June 2023, September 2024 — chosen as low-volatility periods with no major stablecoin or monetary policy news.</w:t>
+        <w:t xml:space="preserve">Replacing the binary Low indicator with a continuous</w:t>
+      </w:r>
+      <w:r>
+        <w:t xml:space="preserve"> </w:t>
+      </w:r>
+      <w:r>
+        <w:rPr>
+          <w:i/>
+          <w:iCs/>
+        </w:rPr>
+        <w:t xml:space="preserve">L</w:t>
+      </w:r>
+      <w:r>
+        <w:t xml:space="preserve"> </w:t>
+      </w:r>
+      <w:r>
+        <w:t xml:space="preserve">× Outflow interaction uses all 100 observations and avoids the sparse-cell concern raised by the threshold specification. The estimating equation is:</w:t>
+      </w:r>
+    </w:p>
+    <w:p>
+      <w:pPr>
+        <w:pStyle w:val="BodyText"/>
+      </w:pPr>
+      <w:r>
+        <w:t xml:space="preserve">ΔSpread*_t* = α + β₁·Inflow*_it* + β₂·Outflow*_it* + β₃·</w:t>
+      </w:r>
+      <w:r>
+        <w:rPr>
+          <w:i/>
+          <w:iCs/>
+        </w:rPr>
+        <w:t xml:space="preserve">L_it</w:t>
+      </w:r>
+      <w:r>
+        <w:t xml:space="preserve"> </w:t>
+      </w:r>
+      <w:r>
+        <w:t xml:space="preserve">+ β₄·</w:t>
+      </w:r>
+      <w:r>
+        <w:rPr>
+          <w:i/>
+          <w:iCs/>
+        </w:rPr>
+        <w:t xml:space="preserve">L_it</w:t>
+      </w:r>
+      <w:r>
+        <w:t xml:space="preserve"> </w:t>
+      </w:r>
+      <w:r>
+        <w:t xml:space="preserve">× Inflow*_it* + β₅·</w:t>
+      </w:r>
+      <w:r>
+        <w:rPr>
+          <w:i/>
+          <w:iCs/>
+        </w:rPr>
+        <w:t xml:space="preserve">L_it</w:t>
+      </w:r>
+      <w:r>
+        <w:t xml:space="preserve"> </w:t>
+      </w:r>
+      <w:r>
+        <w:t xml:space="preserve">× Outflow*_it* + γ·controls + δ·USDT*_i* + ε*_it*</w:t>
+      </w:r>
+    </w:p>
+    <w:p>
+      <w:pPr>
+        <w:pStyle w:val="BodyText"/>
+      </w:pPr>
+      <w:r>
+        <w:t xml:space="preserve">The key coefficient is β₅ (</w:t>
+      </w:r>
+      <w:r>
+        <w:rPr>
+          <w:i/>
+          <w:iCs/>
+        </w:rPr>
+        <w:t xml:space="preserve">L</w:t>
+      </w:r>
+      <w:r>
+        <w:t xml:space="preserve"> </w:t>
+      </w:r>
+      <w:r>
+        <w:t xml:space="preserve">× Outflow): predicted negative — higher buffer dampens the outflow-spread link.</w:t>
+      </w:r>
+    </w:p>
+    <w:tbl>
+      <w:tblPr>
+        <w:tblStyle w:val="Table"/>
+        <w:tblW w:type="auto" w:w="0"/>
+        <w:tblLook w:firstRow="1" w:lastRow="0" w:firstColumn="0" w:lastColumn="0" w:noHBand="0" w:noVBand="0" w:val="0020"/>
+      </w:tblPr>
+      <w:tblGrid>
+        <w:gridCol w:w="1980"/>
+        <w:gridCol w:w="1980"/>
+        <w:gridCol w:w="1980"/>
+        <w:gridCol w:w="1980"/>
+      </w:tblGrid>
+      <w:tr>
+        <w:trPr>
+          <w:tblHeader w:val="on"/>
+        </w:trPr>
+        <w:tc>
+          <w:tcPr/>
+          <w:p>
+            <w:pPr>
+              <w:pStyle w:val="Compact"/>
+            </w:pPr>
+            <w:r>
+              <w:t xml:space="preserve">Variable</w:t>
+            </w:r>
+          </w:p>
+        </w:tc>
+        <w:tc>
+          <w:tcPr/>
+          <w:p>
+            <w:pPr>
+              <w:pStyle w:val="Compact"/>
+            </w:pPr>
+            <w:r>
+              <w:t xml:space="preserve">Coefficient</w:t>
+            </w:r>
+          </w:p>
+        </w:tc>
+        <w:tc>
+          <w:tcPr/>
+          <w:p>
+            <w:pPr>
+              <w:pStyle w:val="Compact"/>
+            </w:pPr>
+            <w:r>
+              <w:rPr>
+                <w:i/>
+                <w:iCs/>
+              </w:rPr>
+              <w:t xml:space="preserve">p</w:t>
+            </w:r>
+            <w:r>
+              <w:t xml:space="preserve">-value</w:t>
+            </w:r>
+          </w:p>
+        </w:tc>
+        <w:tc>
+          <w:tcPr/>
+          <w:p>
+            <w:pPr>
+              <w:pStyle w:val="Compact"/>
+            </w:pPr>
+          </w:p>
+        </w:tc>
+      </w:tr>
+      <w:tr>
+        <w:tc>
+          <w:tcPr/>
+          <w:p>
+            <w:pPr>
+              <w:pStyle w:val="Compact"/>
+            </w:pPr>
+            <w:r>
+              <w:t xml:space="preserve">β₁ Inflow</w:t>
+            </w:r>
+          </w:p>
+        </w:tc>
+        <w:tc>
+          <w:tcPr/>
+          <w:p>
+            <w:pPr>
+              <w:pStyle w:val="Compact"/>
+            </w:pPr>
+            <w:r>
+              <w:t xml:space="preserve">−0.119</w:t>
+            </w:r>
+          </w:p>
+        </w:tc>
+        <w:tc>
+          <w:tcPr/>
+          <w:p>
+            <w:pPr>
+              <w:pStyle w:val="Compact"/>
+            </w:pPr>
+            <w:r>
+              <w:t xml:space="preserve">0.903</w:t>
+            </w:r>
+          </w:p>
+        </w:tc>
+        <w:tc>
+          <w:tcPr/>
+          <w:p>
+            <w:pPr>
+              <w:pStyle w:val="Compact"/>
+            </w:pPr>
+          </w:p>
+        </w:tc>
+      </w:tr>
+      <w:tr>
+        <w:tc>
+          <w:tcPr/>
+          <w:p>
+            <w:pPr>
+              <w:pStyle w:val="Compact"/>
+            </w:pPr>
+            <w:r>
+              <w:t xml:space="preserve">β₂ Outflow</w:t>
+            </w:r>
+          </w:p>
+        </w:tc>
+        <w:tc>
+          <w:tcPr/>
+          <w:p>
+            <w:pPr>
+              <w:pStyle w:val="Compact"/>
+            </w:pPr>
+            <w:r>
+              <w:t xml:space="preserve">+3.774</w:t>
+            </w:r>
+          </w:p>
+        </w:tc>
+        <w:tc>
+          <w:tcPr/>
+          <w:p>
+            <w:pPr>
+              <w:pStyle w:val="Compact"/>
+            </w:pPr>
+            <w:r>
+              <w:t xml:space="preserve">0.134</w:t>
+            </w:r>
+          </w:p>
+        </w:tc>
+        <w:tc>
+          <w:tcPr/>
+          <w:p>
+            <w:pPr>
+              <w:pStyle w:val="Compact"/>
+            </w:pPr>
+          </w:p>
+        </w:tc>
+      </w:tr>
+      <w:tr>
+        <w:tc>
+          <w:tcPr/>
+          <w:p>
+            <w:pPr>
+              <w:pStyle w:val="Compact"/>
+            </w:pPr>
+            <w:r>
+              <w:t xml:space="preserve">β₃</w:t>
+            </w:r>
+            <w:r>
+              <w:t xml:space="preserve"> </w:t>
+            </w:r>
+            <w:r>
+              <w:rPr>
+                <w:i/>
+                <w:iCs/>
+              </w:rPr>
+              <w:t xml:space="preserve">L</w:t>
+            </w:r>
+          </w:p>
+        </w:tc>
+        <w:tc>
+          <w:tcPr/>
+          <w:p>
+            <w:pPr>
+              <w:pStyle w:val="Compact"/>
+            </w:pPr>
+            <w:r>
+              <w:t xml:space="preserve">−0.132</w:t>
+            </w:r>
+          </w:p>
+        </w:tc>
+        <w:tc>
+          <w:tcPr/>
+          <w:p>
+            <w:pPr>
+              <w:pStyle w:val="Compact"/>
+            </w:pPr>
+            <w:r>
+              <w:t xml:space="preserve">0.797</w:t>
+            </w:r>
+          </w:p>
+        </w:tc>
+        <w:tc>
+          <w:tcPr/>
+          <w:p>
+            <w:pPr>
+              <w:pStyle w:val="Compact"/>
+            </w:pPr>
+          </w:p>
+        </w:tc>
+      </w:tr>
+      <w:tr>
+        <w:tc>
+          <w:tcPr/>
+          <w:p>
+            <w:pPr>
+              <w:pStyle w:val="Compact"/>
+            </w:pPr>
+            <w:r>
+              <w:t xml:space="preserve">β₄</w:t>
+            </w:r>
+            <w:r>
+              <w:t xml:space="preserve"> </w:t>
+            </w:r>
+            <w:r>
+              <w:rPr>
+                <w:i/>
+                <w:iCs/>
+              </w:rPr>
+              <w:t xml:space="preserve">L</w:t>
+            </w:r>
+            <w:r>
+              <w:t xml:space="preserve"> </w:t>
+            </w:r>
+            <w:r>
+              <w:t xml:space="preserve">× Inflow</w:t>
+            </w:r>
+          </w:p>
+        </w:tc>
+        <w:tc>
+          <w:tcPr/>
+          <w:p>
+            <w:pPr>
+              <w:pStyle w:val="Compact"/>
+            </w:pPr>
+            <w:r>
+              <w:t xml:space="preserve">+3.307</w:t>
+            </w:r>
+          </w:p>
+        </w:tc>
+        <w:tc>
+          <w:tcPr/>
+          <w:p>
+            <w:pPr>
+              <w:pStyle w:val="Compact"/>
+            </w:pPr>
+            <w:r>
+              <w:t xml:space="preserve">0.642</w:t>
+            </w:r>
+          </w:p>
+        </w:tc>
+        <w:tc>
+          <w:tcPr/>
+          <w:p>
+            <w:pPr>
+              <w:pStyle w:val="Compact"/>
+            </w:pPr>
+          </w:p>
+        </w:tc>
+      </w:tr>
+      <w:tr>
+        <w:tc>
+          <w:tcPr/>
+          <w:p>
+            <w:pPr>
+              <w:pStyle w:val="Compact"/>
+            </w:pPr>
+            <w:r>
+              <w:rPr>
+                <w:b/>
+                <w:bCs/>
+              </w:rPr>
+              <w:t xml:space="preserve">β₅</w:t>
+            </w:r>
+            <w:r>
+              <w:rPr>
+                <w:b/>
+                <w:bCs/>
+              </w:rPr>
+              <w:t xml:space="preserve"> </w:t>
+            </w:r>
+            <w:r>
+              <w:rPr>
+                <w:b/>
+                <w:bCs/>
+                <w:i/>
+                <w:iCs/>
+              </w:rPr>
+              <w:t xml:space="preserve">L</w:t>
+            </w:r>
+            <w:r>
+              <w:rPr>
+                <w:b/>
+                <w:bCs/>
+              </w:rPr>
+              <w:t xml:space="preserve"> </w:t>
+            </w:r>
+            <w:r>
+              <w:rPr>
+                <w:b/>
+                <w:bCs/>
+              </w:rPr>
+              <w:t xml:space="preserve">× Outflow</w:t>
+            </w:r>
+          </w:p>
+        </w:tc>
+        <w:tc>
+          <w:tcPr/>
+          <w:p>
+            <w:pPr>
+              <w:pStyle w:val="Compact"/>
+            </w:pPr>
+            <w:r>
+              <w:rPr>
+                <w:b/>
+                <w:bCs/>
+              </w:rPr>
+              <w:t xml:space="preserve">−18.579</w:t>
+            </w:r>
+          </w:p>
+        </w:tc>
+        <w:tc>
+          <w:tcPr/>
+          <w:p>
+            <w:pPr>
+              <w:pStyle w:val="Compact"/>
+            </w:pPr>
+            <w:r>
+              <w:rPr>
+                <w:b/>
+                <w:bCs/>
+              </w:rPr>
+              <w:t xml:space="preserve">0.120</w:t>
+            </w:r>
+          </w:p>
+        </w:tc>
+        <w:tc>
+          <w:tcPr/>
+          <w:p>
+            <w:pPr>
+              <w:pStyle w:val="Compact"/>
+            </w:pPr>
+          </w:p>
+        </w:tc>
+      </w:tr>
+      <w:tr>
+        <w:tc>
+          <w:tcPr/>
+          <w:p>
+            <w:pPr>
+              <w:pStyle w:val="Compact"/>
+            </w:pPr>
+            <w:r>
+              <w:t xml:space="preserve">VIX</w:t>
+            </w:r>
+          </w:p>
+        </w:tc>
+        <w:tc>
+          <w:tcPr/>
+          <w:p>
+            <w:pPr>
+              <w:pStyle w:val="Compact"/>
+            </w:pPr>
+            <w:r>
+              <w:t xml:space="preserve">+0.009</w:t>
+            </w:r>
+          </w:p>
+        </w:tc>
+        <w:tc>
+          <w:tcPr/>
+          <w:p>
+            <w:pPr>
+              <w:pStyle w:val="Compact"/>
+            </w:pPr>
+            <w:r>
+              <w:t xml:space="preserve">0.003</w:t>
+            </w:r>
+          </w:p>
+        </w:tc>
+        <w:tc>
+          <w:tcPr/>
+          <w:p>
+            <w:pPr>
+              <w:pStyle w:val="Compact"/>
+            </w:pPr>
+            <w:r>
+              <w:t xml:space="preserve">***</w:t>
+            </w:r>
+          </w:p>
+        </w:tc>
+      </w:tr>
+      <w:tr>
+        <w:tc>
+          <w:tcPr/>
+          <w:p>
+            <w:pPr>
+              <w:pStyle w:val="Compact"/>
+            </w:pPr>
+            <w:r>
+              <w:t xml:space="preserve">ΔlnN*</w:t>
+            </w:r>
+          </w:p>
+        </w:tc>
+        <w:tc>
+          <w:tcPr/>
+          <w:p>
+            <w:pPr>
+              <w:pStyle w:val="Compact"/>
+            </w:pPr>
+            <w:r>
+              <w:t xml:space="preserve">+0.042</w:t>
+            </w:r>
+          </w:p>
+        </w:tc>
+        <w:tc>
+          <w:tcPr/>
+          <w:p>
+            <w:pPr>
+              <w:pStyle w:val="Compact"/>
+            </w:pPr>
+            <w:r>
+              <w:t xml:space="preserve">0.851</w:t>
+            </w:r>
+          </w:p>
+        </w:tc>
+        <w:tc>
+          <w:tcPr/>
+          <w:p>
+            <w:pPr>
+              <w:pStyle w:val="Compact"/>
+            </w:pPr>
+          </w:p>
+        </w:tc>
+      </w:tr>
+      <w:tr>
+        <w:tc>
+          <w:tcPr/>
+          <w:p>
+            <w:pPr>
+              <w:pStyle w:val="Compact"/>
+            </w:pPr>
+            <w:r>
+              <w:t xml:space="preserve">USDT fixed effect</w:t>
+            </w:r>
+          </w:p>
+        </w:tc>
+        <w:tc>
+          <w:tcPr/>
+          <w:p>
+            <w:pPr>
+              <w:pStyle w:val="Compact"/>
+            </w:pPr>
+            <w:r>
+              <w:t xml:space="preserve">−0.006</w:t>
+            </w:r>
+          </w:p>
+        </w:tc>
+        <w:tc>
+          <w:tcPr/>
+          <w:p>
+            <w:pPr>
+              <w:pStyle w:val="Compact"/>
+            </w:pPr>
+            <w:r>
+              <w:t xml:space="preserve">0.856</w:t>
+            </w:r>
+          </w:p>
+        </w:tc>
+        <w:tc>
+          <w:tcPr/>
+          <w:p>
+            <w:pPr>
+              <w:pStyle w:val="Compact"/>
+            </w:pPr>
+          </w:p>
+        </w:tc>
+      </w:tr>
+    </w:tbl>
+    <w:p>
+      <w:pPr>
+        <w:pStyle w:val="BodyText"/>
+      </w:pPr>
+      <w:r>
+        <w:rPr>
+          <w:i/>
+          <w:iCs/>
+        </w:rPr>
+        <w:t xml:space="preserve">Note.</w:t>
+      </w:r>
+      <w:r>
+        <w:t xml:space="preserve"> </w:t>
+      </w:r>
+      <w:r>
+        <w:t xml:space="preserve">DV = ΔSpread.</w:t>
+      </w:r>
+      <w:r>
+        <w:t xml:space="preserve"> </w:t>
+      </w:r>
+      <w:r>
+        <w:rPr>
+          <w:i/>
+          <w:iCs/>
+        </w:rPr>
+        <w:t xml:space="preserve">N</w:t>
+      </w:r>
+      <w:r>
+        <w:t xml:space="preserve"> </w:t>
+      </w:r>
+      <w:r>
+        <w:t xml:space="preserve">= 100. SE clustered by month. R² = 0.120.</w:t>
+      </w:r>
+    </w:p>
+    <w:p>
+      <w:pPr>
+        <w:pStyle w:val="BodyText"/>
+      </w:pPr>
+      <w:r>
+        <w:t xml:space="preserve">The sign of β₅ = −18.58 is in the predicted direction: higher liquid buffers reduce the spread impact of outflows. The total outflow effect at any buffer level is β₂ + β₅ ×</w:t>
+      </w:r>
+      <w:r>
+        <w:t xml:space="preserve"> </w:t>
+      </w:r>
+      <w:r>
+        <w:rPr>
+          <w:i/>
+          <w:iCs/>
+        </w:rPr>
+        <w:t xml:space="preserve">L</w:t>
+      </w:r>
+      <w:r>
+        <w:t xml:space="preserve"> </w:t>
+      </w:r>
+      <w:r>
+        <w:t xml:space="preserve">= 3.774 − 18.579 ×</w:t>
+      </w:r>
+      <w:r>
+        <w:t xml:space="preserve"> </w:t>
+      </w:r>
+      <w:r>
+        <w:rPr>
+          <w:i/>
+          <w:iCs/>
+        </w:rPr>
+        <w:t xml:space="preserve">L</w:t>
+      </w:r>
+      <w:r>
+        <w:t xml:space="preserve">, which approaches zero at</w:t>
+      </w:r>
+      <w:r>
+        <w:t xml:space="preserve"> </w:t>
+      </w:r>
+      <w:r>
+        <w:rPr>
+          <w:i/>
+          <w:iCs/>
+        </w:rPr>
+        <w:t xml:space="preserve">L</w:t>
+      </w:r>
+      <w:r>
+        <w:t xml:space="preserve"> </w:t>
+      </w:r>
+      <w:r>
+        <w:t xml:space="preserve">≈ 20% (USDT’s approximate buffer level in 2022) and reaches its maximum at</w:t>
+      </w:r>
+      <w:r>
+        <w:t xml:space="preserve"> </w:t>
+      </w:r>
+      <w:r>
+        <w:rPr>
+          <w:i/>
+          <w:iCs/>
+        </w:rPr>
+        <w:t xml:space="preserve">L</w:t>
+      </w:r>
+      <w:r>
+        <w:t xml:space="preserve"> </w:t>
+      </w:r>
+      <w:r>
+        <w:t xml:space="preserve">≈ 0 (USDT’s trajectory in early 2026). The coefficient is not significant at conventional levels (</w:t>
+      </w:r>
+      <w:r>
+        <w:rPr>
+          <w:i/>
+          <w:iCs/>
+        </w:rPr>
+        <w:t xml:space="preserve">p</w:t>
+      </w:r>
+      <w:r>
+        <w:t xml:space="preserve"> </w:t>
+      </w:r>
+      <w:r>
+        <w:t xml:space="preserve">= 0.12), reflecting the dilution of a nonlinear effect across the full range of</w:t>
+      </w:r>
+      <w:r>
+        <w:t xml:space="preserve"> </w:t>
+      </w:r>
+      <w:r>
+        <w:rPr>
+          <w:i/>
+          <w:iCs/>
+        </w:rPr>
+        <w:t xml:space="preserve">L</w:t>
+      </w:r>
+      <w:r>
+        <w:t xml:space="preserve">. The threshold specification, which concentrates the test at</w:t>
+      </w:r>
+      <w:r>
+        <w:t xml:space="preserve"> </w:t>
+      </w:r>
+      <w:r>
+        <w:rPr>
+          <w:i/>
+          <w:iCs/>
+        </w:rPr>
+        <w:t xml:space="preserve">L</w:t>
+      </w:r>
+      <w:r>
+        <w:t xml:space="preserve"> </w:t>
+      </w:r>
+      <w:r>
+        <w:t xml:space="preserve">&lt; 12%, recovers greater statistical power precisely because the relationship is nonlinear. The two specifications are consistent in economic direction and implied break-even buffer level.</w:t>
       </w:r>
     </w:p>
     <w:bookmarkEnd w:id="56"/>
+    <w:bookmarkStart w:id="57" w:name="X3eb461317b59d3bad3b2301a363379a81a42484"/>
+    <w:p>
+      <w:pPr>
+        <w:pStyle w:val="Heading3"/>
+      </w:pPr>
+      <w:r>
+        <w:t xml:space="preserve">A.7 Event Study: Normal Model and Placebo Design</w:t>
+      </w:r>
+    </w:p>
+    <w:p>
+      <w:pPr>
+        <w:pStyle w:val="FirstParagraph"/>
+      </w:pPr>
+      <w:r>
+        <w:t xml:space="preserve">The normal model is Δspread*_d* = α + γ₁·ΔVIX*_d* + γ₂·ΔlnN**_d* + ε*_d*, estimated over the pre-event window [−120, −6] trading days via OLS. The original level-model specification inflated CARs approximately 120-fold by including the 2022 hiking trend in the estimation window; first-differencing corrects this. Event window: [−5, +20] trading days. Placebo pseudo-events: October 2022, June 2023, September 2024 — chosen as low-volatility periods with no major stablecoin or monetary policy news.</w:t>
+      </w:r>
+    </w:p>
     <w:bookmarkEnd w:id="57"/>
     <w:bookmarkEnd w:id="58"/>
+    <w:bookmarkEnd w:id="59"/>
     <w:sectPr>
       <w:pgSz w:h="16838" w:w="11906"/>
       <w:pgMar w:bottom="1417" w:footer="720" w:gutter="0" w:header="720" w:left="1701" w:right="1701" w:top="1417"/>

</xml_diff>